<commit_message>
outline: perbaiki diagram satu kolom dan tabel matriks model
</commit_message>
<xml_diff>
--- a/outline-model/Outline-Penelitian-Model.docx
+++ b/outline-model/Outline-Penelitian-Model.docx
@@ -43,7 +43,7 @@
       <w:r>
         <w:rPr>
           <w:rFonts w:ascii="Times New Roman" w:hAnsi="Times New Roman" w:eastAsia="Times New Roman"/>
-          <w:b w:val="0"/>
+          <w:b/>
           <w:i w:val="0"/>
           <w:sz w:val="24"/>
         </w:rPr>
@@ -123,7 +123,7 @@
       <w:r>
         <w:rPr>
           <w:rFonts w:ascii="Times New Roman" w:hAnsi="Times New Roman" w:eastAsia="Times New Roman"/>
-          <w:b w:val="0"/>
+          <w:b/>
           <w:i w:val="0"/>
           <w:sz w:val="24"/>
         </w:rPr>
@@ -139,7 +139,7 @@
       <w:r>
         <w:rPr>
           <w:rFonts w:ascii="Times New Roman" w:hAnsi="Times New Roman" w:eastAsia="Times New Roman"/>
-          <w:b w:val="0"/>
+          <w:b/>
           <w:i w:val="0"/>
           <w:sz w:val="24"/>
         </w:rPr>
@@ -946,7 +946,7 @@
     </w:p>
     <w:tbl>
       <w:tblPr>
-        <w:tblW w:type="dxa" w:w="7938"/>
+        <w:tblW w:type="dxa" w:w="7824"/>
         <w:jc w:val="center"/>
         <w:tblLayout w:type="fixed"/>
         <w:tblLook w:firstColumn="1" w:firstRow="1" w:lastColumn="0" w:lastRow="0" w:noHBand="0" w:noVBand="1" w:val="04A0"/>
@@ -961,9 +961,10 @@
         <w:tblLayout w:type="fixed"/>
       </w:tblPr>
       <w:tblGrid>
-        <w:gridCol w:w="2646"/>
-        <w:gridCol w:w="2646"/>
-        <w:gridCol w:w="2646"/>
+        <w:gridCol w:w="1757"/>
+        <w:gridCol w:w="2438"/>
+        <w:gridCol w:w="2494"/>
+        <w:gridCol w:w="1134"/>
       </w:tblGrid>
       <w:tr>
         <w:trPr>
@@ -972,7 +973,7 @@
         </w:trPr>
         <w:tc>
           <w:tcPr>
-            <w:tcW w:type="dxa" w:w="2646"/>
+            <w:tcW w:type="dxa" w:w="1757"/>
           </w:tcPr>
           <w:p>
             <w:pPr>
@@ -988,13 +989,13 @@
                 <w:i w:val="0"/>
                 <w:sz w:val="20"/>
               </w:rPr>
-              <w:t>Klasik non-pembelajaran mesin</w:t>
+              <w:t>Kelompok</w:t>
             </w:r>
           </w:p>
         </w:tc>
         <w:tc>
           <w:tcPr>
-            <w:tcW w:type="dxa" w:w="2646"/>
+            <w:tcW w:type="dxa" w:w="2438"/>
           </w:tcPr>
           <w:p>
             <w:pPr>
@@ -1010,13 +1011,13 @@
                 <w:i w:val="0"/>
                 <w:sz w:val="20"/>
               </w:rPr>
-              <w:t>Auerswal (t.t.); Jiang dan Li (2026)</w:t>
+              <w:t>Sumber</w:t>
             </w:r>
           </w:p>
         </w:tc>
         <w:tc>
           <w:tcPr>
-            <w:tcW w:type="dxa" w:w="2646"/>
+            <w:tcW w:type="dxa" w:w="2494"/>
           </w:tcPr>
           <w:p>
             <w:pPr>
@@ -1032,6 +1033,29 @@
                 <w:i w:val="0"/>
                 <w:sz w:val="20"/>
               </w:rPr>
+              <w:t>Hasil yang dilaporkan</w:t>
+            </w:r>
+          </w:p>
+        </w:tc>
+        <w:tc>
+          <w:tcPr>
+            <w:tcW w:type="dxa" w:w="1134"/>
+          </w:tcPr>
+          <w:p>
+            <w:pPr>
+              <w:spacing w:before="0" w:after="0" w:line="240" w:lineRule="auto"/>
+              <w:ind w:firstLine="0"/>
+              <w:jc w:val="left"/>
+            </w:pPr>
+            <w:r/>
+            <w:r>
+              <w:rPr>
+                <w:rFonts w:ascii="Times New Roman" w:hAnsi="Times New Roman" w:eastAsia="Times New Roman"/>
+                <w:b/>
+                <w:i w:val="0"/>
+                <w:sz w:val="20"/>
+              </w:rPr>
+              <w:t>Keterbatasan</w:t>
             </w:r>
           </w:p>
         </w:tc>
@@ -1042,7 +1066,51 @@
         </w:trPr>
         <w:tc>
           <w:tcPr>
-            <w:tcW w:type="dxa" w:w="2646"/>
+            <w:tcW w:type="dxa" w:w="1757"/>
+          </w:tcPr>
+          <w:p>
+            <w:pPr>
+              <w:spacing w:before="0" w:after="0" w:line="240" w:lineRule="auto"/>
+              <w:ind w:firstLine="0"/>
+              <w:jc w:val="left"/>
+            </w:pPr>
+            <w:r/>
+            <w:r>
+              <w:rPr>
+                <w:rFonts w:ascii="Times New Roman" w:hAnsi="Times New Roman" w:eastAsia="Times New Roman"/>
+                <w:b w:val="0"/>
+                <w:i w:val="0"/>
+                <w:sz w:val="20"/>
+              </w:rPr>
+              <w:t>Klasik non-pembelajaran mesin</w:t>
+            </w:r>
+          </w:p>
+        </w:tc>
+        <w:tc>
+          <w:tcPr>
+            <w:tcW w:type="dxa" w:w="2438"/>
+          </w:tcPr>
+          <w:p>
+            <w:pPr>
+              <w:spacing w:before="0" w:after="0" w:line="240" w:lineRule="auto"/>
+              <w:ind w:firstLine="0"/>
+              <w:jc w:val="left"/>
+            </w:pPr>
+            <w:r/>
+            <w:r>
+              <w:rPr>
+                <w:rFonts w:ascii="Times New Roman" w:hAnsi="Times New Roman" w:eastAsia="Times New Roman"/>
+                <w:b w:val="0"/>
+                <w:i w:val="0"/>
+                <w:sz w:val="20"/>
+              </w:rPr>
+              <w:t>Auerswal (t.t.); Jiang dan Li (2026)</w:t>
+            </w:r>
+          </w:p>
+        </w:tc>
+        <w:tc>
+          <w:tcPr>
+            <w:tcW w:type="dxa" w:w="2494"/>
           </w:tcPr>
           <w:p>
             <w:pPr>
@@ -1064,7 +1132,7 @@
         </w:tc>
         <w:tc>
           <w:tcPr>
-            <w:tcW w:type="dxa" w:w="2646"/>
+            <w:tcW w:type="dxa" w:w="1134"/>
           </w:tcPr>
           <w:p>
             <w:pPr>
@@ -1080,28 +1148,7 @@
                 <w:i w:val="0"/>
                 <w:sz w:val="20"/>
               </w:rPr>
-              <w:t>Bergantung kondisi citra;</w:t>
-            </w:r>
-          </w:p>
-        </w:tc>
-        <w:tc>
-          <w:tcPr>
-            <w:tcW w:type="dxa" w:w="2646"/>
-          </w:tcPr>
-          <w:p>
-            <w:pPr>
-              <w:spacing w:before="0" w:after="0" w:line="240" w:lineRule="auto"/>
-              <w:ind w:firstLine="0"/>
-              <w:jc w:val="left"/>
-            </w:pPr>
-            <w:r/>
-            <w:r>
-              <w:rPr>
-                <w:rFonts w:ascii="Times New Roman" w:hAnsi="Times New Roman" w:eastAsia="Times New Roman"/>
-                <w:b w:val="0"/>
-                <w:i w:val="0"/>
-                <w:sz w:val="20"/>
-              </w:rPr>
+              <w:t>Bergantung kondisi citra; perilaku saat gagal tidak dilaporkan</w:t>
             </w:r>
           </w:p>
         </w:tc>
@@ -1112,7 +1159,7 @@
         </w:trPr>
         <w:tc>
           <w:tcPr>
-            <w:tcW w:type="dxa" w:w="2646"/>
+            <w:tcW w:type="dxa" w:w="1757"/>
           </w:tcPr>
           <w:p>
             <w:pPr>
@@ -1134,7 +1181,7 @@
         </w:tc>
         <w:tc>
           <w:tcPr>
-            <w:tcW w:type="dxa" w:w="2646"/>
+            <w:tcW w:type="dxa" w:w="2438"/>
           </w:tcPr>
           <w:p>
             <w:pPr>
@@ -1150,13 +1197,13 @@
                 <w:i w:val="0"/>
                 <w:sz w:val="20"/>
               </w:rPr>
-              <w:t>Effendi dkk. (2025);</w:t>
+              <w:t>Effendi dkk. (2025); Gushima dan Kashima (2023); Yenneti dkk. (2023); Bonilla-Rivas dkk. (2023); OICWS (2026); Low dkk. (2024)</w:t>
             </w:r>
           </w:p>
         </w:tc>
         <w:tc>
           <w:tcPr>
-            <w:tcW w:type="dxa" w:w="2646"/>
+            <w:tcW w:type="dxa" w:w="2494"/>
           </w:tcPr>
           <w:p>
             <w:pPr>
@@ -1172,17 +1219,13 @@
                 <w:i w:val="0"/>
                 <w:sz w:val="20"/>
               </w:rPr>
+              <w:t>90,37% exact match dengan CER 3,6%; 96,8%; 97,8% per bingkai; 98%</w:t>
             </w:r>
           </w:p>
         </w:tc>
-      </w:tr>
-      <w:tr>
-        <w:trPr>
-          <w:cantSplit/>
-        </w:trPr>
         <w:tc>
           <w:tcPr>
-            <w:tcW w:type="dxa" w:w="2646"/>
+            <w:tcW w:type="dxa" w:w="1134"/>
           </w:tcPr>
           <w:p>
             <w:pPr>
@@ -1198,50 +1241,7 @@
                 <w:i w:val="0"/>
                 <w:sz w:val="20"/>
               </w:rPr>
-              <w:t>96,8%; 97,8% per bingkai; 98%</w:t>
-            </w:r>
-          </w:p>
-        </w:tc>
-        <w:tc>
-          <w:tcPr>
-            <w:tcW w:type="dxa" w:w="2646"/>
-          </w:tcPr>
-          <w:p>
-            <w:pPr>
-              <w:spacing w:before="0" w:after="0" w:line="240" w:lineRule="auto"/>
-              <w:ind w:firstLine="0"/>
-              <w:jc w:val="left"/>
-            </w:pPr>
-            <w:r/>
-            <w:r>
-              <w:rPr>
-                <w:rFonts w:ascii="Times New Roman" w:hAnsi="Times New Roman" w:eastAsia="Times New Roman"/>
-                <w:b w:val="0"/>
-                <w:i w:val="0"/>
-                <w:sz w:val="20"/>
-              </w:rPr>
-              <w:t>Seluruhnya berhenti pada akurasi kumpulan</w:t>
-            </w:r>
-          </w:p>
-        </w:tc>
-        <w:tc>
-          <w:tcPr>
-            <w:tcW w:type="dxa" w:w="2646"/>
-          </w:tcPr>
-          <w:p>
-            <w:pPr>
-              <w:spacing w:before="0" w:after="0" w:line="240" w:lineRule="auto"/>
-              <w:ind w:firstLine="0"/>
-              <w:jc w:val="left"/>
-            </w:pPr>
-            <w:r/>
-            <w:r>
-              <w:rPr>
-                <w:rFonts w:ascii="Times New Roman" w:hAnsi="Times New Roman" w:eastAsia="Times New Roman"/>
-                <w:b w:val="0"/>
-                <w:i w:val="0"/>
-                <w:sz w:val="20"/>
-              </w:rPr>
+              <w:t>Seluruhnya berhenti pada akurasi kumpulan data sendiri</w:t>
             </w:r>
           </w:p>
         </w:tc>
@@ -1252,7 +1252,7 @@
         </w:trPr>
         <w:tc>
           <w:tcPr>
-            <w:tcW w:type="dxa" w:w="2646"/>
+            <w:tcW w:type="dxa" w:w="1757"/>
           </w:tcPr>
           <w:p>
             <w:pPr>
@@ -1274,7 +1274,7 @@
         </w:tc>
         <w:tc>
           <w:tcPr>
-            <w:tcW w:type="dxa" w:w="2646"/>
+            <w:tcW w:type="dxa" w:w="2438"/>
           </w:tcPr>
           <w:p>
             <w:pPr>
@@ -1290,13 +1290,13 @@
                 <w:i w:val="0"/>
                 <w:sz w:val="20"/>
               </w:rPr>
-              <w:t>Laroca dkk. (2019);</w:t>
+              <w:t>Laroca dkk. (2019); Kanagarathinam dan Sekar (2019)</w:t>
             </w:r>
           </w:p>
         </w:tc>
         <w:tc>
           <w:tcPr>
-            <w:tcW w:type="dxa" w:w="2646"/>
+            <w:tcW w:type="dxa" w:w="2494"/>
           </w:tcPr>
           <w:p>
             <w:pPr>
@@ -1312,39 +1312,13 @@
                 <w:i w:val="0"/>
                 <w:sz w:val="20"/>
               </w:rPr>
-            </w:r>
-          </w:p>
-        </w:tc>
-      </w:tr>
-      <w:tr>
-        <w:trPr>
-          <w:cantSplit/>
-        </w:trPr>
-        <w:tc>
-          <w:tcPr>
-            <w:tcW w:type="dxa" w:w="2646"/>
-          </w:tcPr>
-          <w:p>
-            <w:pPr>
-              <w:spacing w:before="0" w:after="0" w:line="240" w:lineRule="auto"/>
-              <w:ind w:firstLine="0"/>
-              <w:jc w:val="left"/>
-            </w:pPr>
-            <w:r/>
-            <w:r>
-              <w:rPr>
-                <w:rFonts w:ascii="Times New Roman" w:hAnsi="Times New Roman" w:eastAsia="Times New Roman"/>
-                <w:b w:val="0"/>
-                <w:i w:val="0"/>
-                <w:sz w:val="20"/>
-              </w:rPr>
-              <w:t>digit</w:t>
+              <w:t>2.000 citra dan 10.000 anotasi tingkat digit</w:t>
             </w:r>
           </w:p>
         </w:tc>
         <w:tc>
           <w:tcPr>
-            <w:tcW w:type="dxa" w:w="2646"/>
+            <w:tcW w:type="dxa" w:w="1134"/>
           </w:tcPr>
           <w:p>
             <w:pPr>
@@ -1364,27 +1338,6 @@
             </w:r>
           </w:p>
         </w:tc>
-        <w:tc>
-          <w:tcPr>
-            <w:tcW w:type="dxa" w:w="2646"/>
-          </w:tcPr>
-          <w:p>
-            <w:pPr>
-              <w:spacing w:before="0" w:after="0" w:line="240" w:lineRule="auto"/>
-              <w:ind w:firstLine="0"/>
-              <w:jc w:val="left"/>
-            </w:pPr>
-            <w:r/>
-            <w:r>
-              <w:rPr>
-                <w:rFonts w:ascii="Times New Roman" w:hAnsi="Times New Roman" w:eastAsia="Times New Roman"/>
-                <w:b w:val="0"/>
-                <w:i w:val="0"/>
-                <w:sz w:val="20"/>
-              </w:rPr>
-            </w:r>
-          </w:p>
-        </w:tc>
       </w:tr>
       <w:tr>
         <w:trPr>
@@ -1392,7 +1345,7 @@
         </w:trPr>
         <w:tc>
           <w:tcPr>
-            <w:tcW w:type="dxa" w:w="2646"/>
+            <w:tcW w:type="dxa" w:w="1757"/>
           </w:tcPr>
           <w:p>
             <w:pPr>
@@ -1414,7 +1367,7 @@
         </w:tc>
         <w:tc>
           <w:tcPr>
-            <w:tcW w:type="dxa" w:w="2646"/>
+            <w:tcW w:type="dxa" w:w="2438"/>
           </w:tcPr>
           <w:p>
             <w:pPr>
@@ -1430,13 +1383,13 @@
                 <w:i w:val="0"/>
                 <w:sz w:val="20"/>
               </w:rPr>
-              <w:t>Zhang dkk. (2026);</w:t>
+              <w:t>Zhang dkk. (2026); Cui dkk. (2026)</w:t>
             </w:r>
           </w:p>
         </w:tc>
         <w:tc>
           <w:tcPr>
-            <w:tcW w:type="dxa" w:w="2646"/>
+            <w:tcW w:type="dxa" w:w="2494"/>
           </w:tcPr>
           <w:p>
             <w:pPr>
@@ -1452,17 +1405,13 @@
                 <w:i w:val="0"/>
                 <w:sz w:val="20"/>
               </w:rPr>
+              <w:t>83,2% rata-rata 15 kategori pada 34,5 juta parameter</w:t>
             </w:r>
           </w:p>
         </w:tc>
-      </w:tr>
-      <w:tr>
-        <w:trPr>
-          <w:cantSplit/>
-        </w:trPr>
         <w:tc>
           <w:tcPr>
-            <w:tcW w:type="dxa" w:w="2646"/>
+            <w:tcW w:type="dxa" w:w="1134"/>
           </w:tcPr>
           <w:p>
             <w:pPr>
@@ -1478,50 +1427,7 @@
                 <w:i w:val="0"/>
                 <w:sz w:val="20"/>
               </w:rPr>
-              <w:t>parameter</w:t>
-            </w:r>
-          </w:p>
-        </w:tc>
-        <w:tc>
-          <w:tcPr>
-            <w:tcW w:type="dxa" w:w="2646"/>
-          </w:tcPr>
-          <w:p>
-            <w:pPr>
-              <w:spacing w:before="0" w:after="0" w:line="240" w:lineRule="auto"/>
-              <w:ind w:firstLine="0"/>
-              <w:jc w:val="left"/>
-            </w:pPr>
-            <w:r/>
-            <w:r>
-              <w:rPr>
-                <w:rFonts w:ascii="Times New Roman" w:hAnsi="Times New Roman" w:eastAsia="Times New Roman"/>
-                <w:b w:val="0"/>
-                <w:i w:val="0"/>
-                <w:sz w:val="20"/>
-              </w:rPr>
-              <w:t>Mengklaim menangani tampilan digital, belum diuji pada tujuh</w:t>
-            </w:r>
-          </w:p>
-        </w:tc>
-        <w:tc>
-          <w:tcPr>
-            <w:tcW w:type="dxa" w:w="2646"/>
-          </w:tcPr>
-          <w:p>
-            <w:pPr>
-              <w:spacing w:before="0" w:after="0" w:line="240" w:lineRule="auto"/>
-              <w:ind w:firstLine="0"/>
-              <w:jc w:val="left"/>
-            </w:pPr>
-            <w:r/>
-            <w:r>
-              <w:rPr>
-                <w:rFonts w:ascii="Times New Roman" w:hAnsi="Times New Roman" w:eastAsia="Times New Roman"/>
-                <w:b w:val="0"/>
-                <w:i w:val="0"/>
-                <w:sz w:val="20"/>
-              </w:rPr>
+              <w:t>Mengklaim menangani tampilan digital, belum diuji pada tujuh segmen</w:t>
             </w:r>
           </w:p>
         </w:tc>
@@ -1532,7 +1438,7 @@
         </w:trPr>
         <w:tc>
           <w:tcPr>
-            <w:tcW w:type="dxa" w:w="2646"/>
+            <w:tcW w:type="dxa" w:w="1757"/>
           </w:tcPr>
           <w:p>
             <w:pPr>
@@ -1554,7 +1460,7 @@
         </w:tc>
         <w:tc>
           <w:tcPr>
-            <w:tcW w:type="dxa" w:w="2646"/>
+            <w:tcW w:type="dxa" w:w="2438"/>
           </w:tcPr>
           <w:p>
             <w:pPr>
@@ -1576,54 +1482,7 @@
         </w:tc>
         <w:tc>
           <w:tcPr>
-            <w:tcW w:type="dxa" w:w="2646"/>
-          </w:tcPr>
-          <w:p>
-            <w:pPr>
-              <w:spacing w:before="0" w:after="0" w:line="240" w:lineRule="auto"/>
-              <w:ind w:firstLine="0"/>
-              <w:jc w:val="left"/>
-            </w:pPr>
-            <w:r/>
-            <w:r>
-              <w:rPr>
-                <w:rFonts w:ascii="Times New Roman" w:hAnsi="Times New Roman" w:eastAsia="Times New Roman"/>
-                <w:b w:val="0"/>
-                <w:i w:val="0"/>
-                <w:sz w:val="20"/>
-              </w:rPr>
-            </w:r>
-          </w:p>
-        </w:tc>
-      </w:tr>
-      <w:tr>
-        <w:trPr>
-          <w:cantSplit/>
-        </w:trPr>
-        <w:tc>
-          <w:tcPr>
-            <w:tcW w:type="dxa" w:w="2646"/>
-          </w:tcPr>
-          <w:p>
-            <w:pPr>
-              <w:spacing w:before="0" w:after="0" w:line="240" w:lineRule="auto"/>
-              <w:ind w:firstLine="0"/>
-              <w:jc w:val="left"/>
-            </w:pPr>
-            <w:r/>
-            <w:r>
-              <w:rPr>
-                <w:rFonts w:ascii="Times New Roman" w:hAnsi="Times New Roman" w:eastAsia="Times New Roman"/>
-                <w:b w:val="0"/>
-                <w:i w:val="0"/>
-                <w:sz w:val="20"/>
-              </w:rPr>
-            </w:r>
-          </w:p>
-        </w:tc>
-        <w:tc>
-          <w:tcPr>
-            <w:tcW w:type="dxa" w:w="2646"/>
+            <w:tcW w:type="dxa" w:w="2494"/>
           </w:tcPr>
           <w:p>
             <w:pPr>
@@ -1645,54 +1504,7 @@
         </w:tc>
         <w:tc>
           <w:tcPr>
-            <w:tcW w:type="dxa" w:w="2646"/>
-          </w:tcPr>
-          <w:p>
-            <w:pPr>
-              <w:spacing w:before="0" w:after="0" w:line="240" w:lineRule="auto"/>
-              <w:ind w:firstLine="0"/>
-              <w:jc w:val="left"/>
-            </w:pPr>
-            <w:r/>
-            <w:r>
-              <w:rPr>
-                <w:rFonts w:ascii="Times New Roman" w:hAnsi="Times New Roman" w:eastAsia="Times New Roman"/>
-                <w:b w:val="0"/>
-                <w:i w:val="0"/>
-                <w:sz w:val="20"/>
-              </w:rPr>
-            </w:r>
-          </w:p>
-        </w:tc>
-      </w:tr>
-      <w:tr>
-        <w:trPr>
-          <w:cantSplit/>
-        </w:trPr>
-        <w:tc>
-          <w:tcPr>
-            <w:tcW w:type="dxa" w:w="2646"/>
-          </w:tcPr>
-          <w:p>
-            <w:pPr>
-              <w:spacing w:before="0" w:after="0" w:line="240" w:lineRule="auto"/>
-              <w:ind w:firstLine="0"/>
-              <w:jc w:val="left"/>
-            </w:pPr>
-            <w:r/>
-            <w:r>
-              <w:rPr>
-                <w:rFonts w:ascii="Times New Roman" w:hAnsi="Times New Roman" w:eastAsia="Times New Roman"/>
-                <w:b w:val="0"/>
-                <w:i w:val="0"/>
-                <w:sz w:val="20"/>
-              </w:rPr>
-            </w:r>
-          </w:p>
-        </w:tc>
-        <w:tc>
-          <w:tcPr>
-            <w:tcW w:type="dxa" w:w="2646"/>
+            <w:tcW w:type="dxa" w:w="1134"/>
           </w:tcPr>
           <w:p>
             <w:pPr>
@@ -1712,9 +1524,202 @@
             </w:r>
           </w:p>
         </w:tc>
+      </w:tr>
+    </w:tbl>
+    <w:p/>
+    <w:p>
+      <w:pPr>
+        <w:pStyle w:val="Heading2"/>
+      </w:pPr>
+      <w:r>
+        <w:rPr>
+          <w:rFonts w:ascii="Times New Roman" w:hAnsi="Times New Roman" w:eastAsia="Times New Roman"/>
+          <w:b/>
+          <w:i w:val="0"/>
+          <w:sz w:val="24"/>
+        </w:rPr>
+        <w:t>2.2 Dua Angka yang Tampak Bertentangan</w:t>
+      </w:r>
+    </w:p>
+    <w:p>
+      <w:pPr>
+        <w:spacing w:before="0" w:after="0" w:line="480" w:lineRule="auto"/>
+        <w:ind w:firstLine="720"/>
+        <w:jc w:val="both"/>
+      </w:pPr>
+      <w:r>
+        <w:rPr>
+          <w:rFonts w:ascii="Times New Roman" w:hAnsi="Times New Roman" w:eastAsia="Times New Roman"/>
+          <w:b w:val="0"/>
+          <w:i w:val="0"/>
+          <w:sz w:val="24"/>
+        </w:rPr>
+        <w:t>Ega dkk. (2026) melaporkan full-string recognition 93,85% untuk Gemini pada perangkat ukur digital, sedangkan Lin dkk. (2026) melaporkan model bahasa-visi terbaik hanya mencapai 30,2% pada data nyata. Keduanya tidak bertentangan: pengujian pertama menilai transkripsi digit yang telah tertulis, sedangkan pengujian kedua menuntut inferensi skala dan penalaran spasial. Pada domain penelitian ini, yaitu transkripsi digit, model bahasa-visi bukan pesaing akurasi melainkan pesaing biaya.</w:t>
+      </w:r>
+    </w:p>
+    <w:p>
+      <w:pPr>
+        <w:pStyle w:val="Heading2"/>
+      </w:pPr>
+      <w:r>
+        <w:rPr>
+          <w:rFonts w:ascii="Times New Roman" w:hAnsi="Times New Roman" w:eastAsia="Times New Roman"/>
+          <w:b/>
+          <w:i w:val="0"/>
+          <w:sz w:val="24"/>
+        </w:rPr>
+        <w:t>2.3 Mengapa Akurasi Tidak Cukup</w:t>
+      </w:r>
+    </w:p>
+    <w:p>
+      <w:pPr>
+        <w:spacing w:before="0" w:after="0" w:line="480" w:lineRule="auto"/>
+        <w:ind w:firstLine="720"/>
+        <w:jc w:val="both"/>
+      </w:pPr>
+      <w:r>
+        <w:rPr>
+          <w:rFonts w:ascii="Times New Roman" w:hAnsi="Times New Roman" w:eastAsia="Times New Roman"/>
+          <w:b w:val="0"/>
+          <w:i w:val="0"/>
+          <w:sz w:val="24"/>
+        </w:rPr>
+        <w:t>Akurasi merupakan besaran agregat yang hanya dapat dihitung setelah nilai sebenarnya diketahui. Pada eksperimen, nilai sebenarnya tersedia karena peneliti membandingkan keluaran model dengan label. Pada saat sistem berjalan di lapangan, nilai sebenarnya justru belum diketahui, sehingga akurasi tidak tersedia sebagai dasar keputusan.</w:t>
+      </w:r>
+    </w:p>
+    <w:p>
+      <w:pPr>
+        <w:spacing w:before="0" w:after="0" w:line="480" w:lineRule="auto"/>
+        <w:ind w:firstLine="720"/>
+        <w:jc w:val="both"/>
+      </w:pPr>
+      <w:r>
+        <w:rPr>
+          <w:rFonts w:ascii="Times New Roman" w:hAnsi="Times New Roman" w:eastAsia="Times New Roman"/>
+          <w:b w:val="0"/>
+          <w:i w:val="0"/>
+          <w:sz w:val="24"/>
+        </w:rPr>
+        <w:t>Selain itu, akurasi tidak menentukan bacaan mana yang salah. Dua sistem dengan akurasi identik dapat memiliki laju kesalahan senyap yang sangat berbeda, sebagaimana disajikan pada Tabel II.2.</w:t>
+      </w:r>
+    </w:p>
+    <w:p>
+      <w:pPr>
+        <w:keepNext/>
+        <w:spacing w:before="0" w:after="0" w:line="240" w:lineRule="auto"/>
+        <w:ind w:firstLine="0"/>
+        <w:jc w:val="center"/>
+      </w:pPr>
+      <w:r>
+        <w:rPr>
+          <w:rFonts w:ascii="Times New Roman" w:hAnsi="Times New Roman" w:eastAsia="Times New Roman"/>
+          <w:b/>
+          <w:i w:val="0"/>
+          <w:sz w:val="20"/>
+        </w:rPr>
+        <w:t>Tabel II.2  Dua sistem dengan akurasi identik dan keandalan berbeda</w:t>
+      </w:r>
+    </w:p>
+    <w:tbl>
+      <w:tblPr>
+        <w:tblW w:type="dxa" w:w="6804"/>
+        <w:jc w:val="center"/>
+        <w:tblLayout w:type="fixed"/>
+        <w:tblLook w:firstColumn="1" w:firstRow="1" w:lastColumn="0" w:lastRow="0" w:noHBand="0" w:noVBand="1" w:val="04A0"/>
+        <w:tblBorders>
+          <w:top w:val="single" w:sz="8" w:color="000000"/>
+          <w:bottom w:val="single" w:sz="8" w:color="000000"/>
+          <w:insideH w:val="single" w:sz="4" w:color="000000"/>
+          <w:left w:val="none" w:sz="0" w:color="000000"/>
+          <w:right w:val="none" w:sz="0" w:color="000000"/>
+          <w:insideV w:val="none" w:sz="0" w:color="000000"/>
+        </w:tblBorders>
+        <w:tblLayout w:type="fixed"/>
+      </w:tblPr>
+      <w:tblGrid>
+        <w:gridCol w:w="3175"/>
+        <w:gridCol w:w="1814"/>
+        <w:gridCol w:w="1814"/>
+      </w:tblGrid>
+      <w:tr>
+        <w:trPr>
+          <w:cantSplit/>
+          <w:tblHeader/>
+        </w:trPr>
         <w:tc>
           <w:tcPr>
-            <w:tcW w:type="dxa" w:w="2646"/>
+            <w:tcW w:type="dxa" w:w="3175"/>
+          </w:tcPr>
+          <w:p>
+            <w:pPr>
+              <w:spacing w:before="0" w:after="0" w:line="240" w:lineRule="auto"/>
+              <w:ind w:firstLine="0"/>
+              <w:jc w:val="left"/>
+            </w:pPr>
+            <w:r/>
+            <w:r>
+              <w:rPr>
+                <w:rFonts w:ascii="Times New Roman" w:hAnsi="Times New Roman" w:eastAsia="Times New Roman"/>
+                <w:b/>
+                <w:i w:val="0"/>
+                <w:sz w:val="20"/>
+              </w:rPr>
+              <w:t>Ukuran</w:t>
+            </w:r>
+          </w:p>
+        </w:tc>
+        <w:tc>
+          <w:tcPr>
+            <w:tcW w:type="dxa" w:w="1814"/>
+          </w:tcPr>
+          <w:p>
+            <w:pPr>
+              <w:spacing w:before="0" w:after="0" w:line="240" w:lineRule="auto"/>
+              <w:ind w:firstLine="0"/>
+              <w:jc w:val="left"/>
+            </w:pPr>
+            <w:r/>
+            <w:r>
+              <w:rPr>
+                <w:rFonts w:ascii="Times New Roman" w:hAnsi="Times New Roman" w:eastAsia="Times New Roman"/>
+                <w:b/>
+                <w:i w:val="0"/>
+                <w:sz w:val="20"/>
+              </w:rPr>
+              <w:t>Sistem A</w:t>
+            </w:r>
+          </w:p>
+        </w:tc>
+        <w:tc>
+          <w:tcPr>
+            <w:tcW w:type="dxa" w:w="1814"/>
+          </w:tcPr>
+          <w:p>
+            <w:pPr>
+              <w:spacing w:before="0" w:after="0" w:line="240" w:lineRule="auto"/>
+              <w:ind w:firstLine="0"/>
+              <w:jc w:val="left"/>
+            </w:pPr>
+            <w:r/>
+            <w:r>
+              <w:rPr>
+                <w:rFonts w:ascii="Times New Roman" w:hAnsi="Times New Roman" w:eastAsia="Times New Roman"/>
+                <w:b/>
+                <w:i w:val="0"/>
+                <w:sz w:val="20"/>
+              </w:rPr>
+              <w:t>Sistem B</w:t>
+            </w:r>
+          </w:p>
+        </w:tc>
+      </w:tr>
+      <w:tr>
+        <w:trPr>
+          <w:cantSplit/>
+        </w:trPr>
+        <w:tc>
+          <w:tcPr>
+            <w:tcW w:type="dxa" w:w="3175"/>
           </w:tcPr>
           <w:p>
             <w:pPr>
@@ -1730,134 +1735,13 @@
                 <w:i w:val="0"/>
                 <w:sz w:val="20"/>
               </w:rPr>
+              <w:t>Akurasi pada data uji</w:t>
             </w:r>
           </w:p>
         </w:tc>
-      </w:tr>
-    </w:tbl>
-    <w:p/>
-    <w:p>
-      <w:pPr>
-        <w:pStyle w:val="Heading2"/>
-      </w:pPr>
-      <w:r>
-        <w:rPr>
-          <w:rFonts w:ascii="Times New Roman" w:hAnsi="Times New Roman" w:eastAsia="Times New Roman"/>
-          <w:b/>
-          <w:i w:val="0"/>
-          <w:sz w:val="24"/>
-        </w:rPr>
-        <w:t>2.2 Dua Angka yang Tampak Bertentangan</w:t>
-      </w:r>
-    </w:p>
-    <w:p>
-      <w:pPr>
-        <w:spacing w:before="0" w:after="0" w:line="480" w:lineRule="auto"/>
-        <w:ind w:firstLine="720"/>
-        <w:jc w:val="both"/>
-      </w:pPr>
-      <w:r>
-        <w:rPr>
-          <w:rFonts w:ascii="Times New Roman" w:hAnsi="Times New Roman" w:eastAsia="Times New Roman"/>
-          <w:b w:val="0"/>
-          <w:i w:val="0"/>
-          <w:sz w:val="24"/>
-        </w:rPr>
-        <w:t>Ega dkk. (2026) melaporkan full-string recognition 93,85% untuk Gemini pada perangkat ukur digital, sedangkan Lin dkk. (2026) melaporkan model bahasa-visi terbaik hanya mencapai 30,2% pada data nyata. Keduanya tidak bertentangan: pengujian pertama menilai transkripsi digit yang telah tertulis, sedangkan pengujian kedua menuntut inferensi skala dan penalaran spasial. Pada domain penelitian ini, yaitu transkripsi digit, model bahasa-visi bukan pesaing akurasi melainkan pesaing biaya.</w:t>
-      </w:r>
-    </w:p>
-    <w:p>
-      <w:pPr>
-        <w:pStyle w:val="Heading2"/>
-      </w:pPr>
-      <w:r>
-        <w:rPr>
-          <w:rFonts w:ascii="Times New Roman" w:hAnsi="Times New Roman" w:eastAsia="Times New Roman"/>
-          <w:b/>
-          <w:i w:val="0"/>
-          <w:sz w:val="24"/>
-        </w:rPr>
-        <w:t>2.3 Mengapa Akurasi Tidak Cukup</w:t>
-      </w:r>
-    </w:p>
-    <w:p>
-      <w:pPr>
-        <w:spacing w:before="0" w:after="0" w:line="480" w:lineRule="auto"/>
-        <w:ind w:firstLine="720"/>
-        <w:jc w:val="both"/>
-      </w:pPr>
-      <w:r>
-        <w:rPr>
-          <w:rFonts w:ascii="Times New Roman" w:hAnsi="Times New Roman" w:eastAsia="Times New Roman"/>
-          <w:b w:val="0"/>
-          <w:i w:val="0"/>
-          <w:sz w:val="24"/>
-        </w:rPr>
-        <w:t>Akurasi merupakan besaran agregat yang hanya dapat dihitung setelah nilai sebenarnya diketahui. Pada eksperimen, nilai sebenarnya tersedia karena peneliti membandingkan keluaran model dengan label. Pada saat sistem berjalan di lapangan, nilai sebenarnya justru belum diketahui, sehingga akurasi tidak tersedia sebagai dasar keputusan.</w:t>
-      </w:r>
-    </w:p>
-    <w:p>
-      <w:pPr>
-        <w:spacing w:before="0" w:after="0" w:line="480" w:lineRule="auto"/>
-        <w:ind w:firstLine="720"/>
-        <w:jc w:val="both"/>
-      </w:pPr>
-      <w:r>
-        <w:rPr>
-          <w:rFonts w:ascii="Times New Roman" w:hAnsi="Times New Roman" w:eastAsia="Times New Roman"/>
-          <w:b w:val="0"/>
-          <w:i w:val="0"/>
-          <w:sz w:val="24"/>
-        </w:rPr>
-        <w:t>Selain itu, akurasi tidak menentukan bacaan mana yang salah. Dua sistem dengan akurasi identik dapat memiliki laju kesalahan senyap yang sangat berbeda, sebagaimana disajikan pada Tabel II.2.</w:t>
-      </w:r>
-    </w:p>
-    <w:p>
-      <w:pPr>
-        <w:keepNext/>
-        <w:spacing w:before="0" w:after="0" w:line="240" w:lineRule="auto"/>
-        <w:ind w:firstLine="0"/>
-        <w:jc w:val="center"/>
-      </w:pPr>
-      <w:r>
-        <w:rPr>
-          <w:rFonts w:ascii="Times New Roman" w:hAnsi="Times New Roman" w:eastAsia="Times New Roman"/>
-          <w:b/>
-          <w:i w:val="0"/>
-          <w:sz w:val="20"/>
-        </w:rPr>
-        <w:t>Tabel II.2  Dua sistem dengan akurasi identik dan keandalan berbeda</w:t>
-      </w:r>
-    </w:p>
-    <w:tbl>
-      <w:tblPr>
-        <w:tblW w:type="dxa" w:w="7938"/>
-        <w:jc w:val="center"/>
-        <w:tblLayout w:type="fixed"/>
-        <w:tblLook w:firstColumn="1" w:firstRow="1" w:lastColumn="0" w:lastRow="0" w:noHBand="0" w:noVBand="1" w:val="04A0"/>
-        <w:tblBorders>
-          <w:top w:val="single" w:sz="8" w:color="000000"/>
-          <w:bottom w:val="single" w:sz="8" w:color="000000"/>
-          <w:insideH w:val="single" w:sz="4" w:color="000000"/>
-          <w:left w:val="none" w:sz="0" w:color="000000"/>
-          <w:right w:val="none" w:sz="0" w:color="000000"/>
-          <w:insideV w:val="none" w:sz="0" w:color="000000"/>
-        </w:tblBorders>
-        <w:tblLayout w:type="fixed"/>
-      </w:tblPr>
-      <w:tblGrid>
-        <w:gridCol w:w="2646"/>
-        <w:gridCol w:w="2646"/>
-        <w:gridCol w:w="2646"/>
-      </w:tblGrid>
-      <w:tr>
-        <w:trPr>
-          <w:cantSplit/>
-          <w:tblHeader/>
-        </w:trPr>
         <w:tc>
           <w:tcPr>
-            <w:tcW w:type="dxa" w:w="2646"/>
+            <w:tcW w:type="dxa" w:w="1814"/>
           </w:tcPr>
           <w:p>
             <w:pPr>
@@ -1869,17 +1753,17 @@
             <w:r>
               <w:rPr>
                 <w:rFonts w:ascii="Times New Roman" w:hAnsi="Times New Roman" w:eastAsia="Times New Roman"/>
-                <w:b/>
+                <w:b w:val="0"/>
                 <w:i w:val="0"/>
                 <w:sz w:val="20"/>
               </w:rPr>
-              <w:t>Akurasi pada data uji</w:t>
+              <w:t>90%</w:t>
             </w:r>
           </w:p>
         </w:tc>
         <w:tc>
           <w:tcPr>
-            <w:tcW w:type="dxa" w:w="2646"/>
+            <w:tcW w:type="dxa" w:w="1814"/>
           </w:tcPr>
           <w:p>
             <w:pPr>
@@ -1891,29 +1775,7 @@
             <w:r>
               <w:rPr>
                 <w:rFonts w:ascii="Times New Roman" w:hAnsi="Times New Roman" w:eastAsia="Times New Roman"/>
-                <w:b/>
-                <w:i w:val="0"/>
-                <w:sz w:val="20"/>
-              </w:rPr>
-              <w:t>90%</w:t>
-            </w:r>
-          </w:p>
-        </w:tc>
-        <w:tc>
-          <w:tcPr>
-            <w:tcW w:type="dxa" w:w="2646"/>
-          </w:tcPr>
-          <w:p>
-            <w:pPr>
-              <w:spacing w:before="0" w:after="0" w:line="240" w:lineRule="auto"/>
-              <w:ind w:firstLine="0"/>
-              <w:jc w:val="left"/>
-            </w:pPr>
-            <w:r/>
-            <w:r>
-              <w:rPr>
-                <w:rFonts w:ascii="Times New Roman" w:hAnsi="Times New Roman" w:eastAsia="Times New Roman"/>
-                <w:b/>
+                <w:b w:val="0"/>
                 <w:i w:val="0"/>
                 <w:sz w:val="20"/>
               </w:rPr>
@@ -1928,7 +1790,7 @@
         </w:trPr>
         <w:tc>
           <w:tcPr>
-            <w:tcW w:type="dxa" w:w="2646"/>
+            <w:tcW w:type="dxa" w:w="3175"/>
           </w:tcPr>
           <w:p>
             <w:pPr>
@@ -1950,7 +1812,7 @@
         </w:tc>
         <w:tc>
           <w:tcPr>
-            <w:tcW w:type="dxa" w:w="2646"/>
+            <w:tcW w:type="dxa" w:w="1814"/>
           </w:tcPr>
           <w:p>
             <w:pPr>
@@ -1972,7 +1834,7 @@
         </w:tc>
         <w:tc>
           <w:tcPr>
-            <w:tcW w:type="dxa" w:w="2646"/>
+            <w:tcW w:type="dxa" w:w="1814"/>
           </w:tcPr>
           <w:p>
             <w:pPr>
@@ -1999,7 +1861,7 @@
         </w:trPr>
         <w:tc>
           <w:tcPr>
-            <w:tcW w:type="dxa" w:w="2646"/>
+            <w:tcW w:type="dxa" w:w="3175"/>
           </w:tcPr>
           <w:p>
             <w:pPr>
@@ -2021,7 +1883,7 @@
         </w:tc>
         <w:tc>
           <w:tcPr>
-            <w:tcW w:type="dxa" w:w="2646"/>
+            <w:tcW w:type="dxa" w:w="1814"/>
           </w:tcPr>
           <w:p>
             <w:pPr>
@@ -2043,7 +1905,7 @@
         </w:tc>
         <w:tc>
           <w:tcPr>
-            <w:tcW w:type="dxa" w:w="2646"/>
+            <w:tcW w:type="dxa" w:w="1814"/>
           </w:tcPr>
           <w:p>
             <w:pPr>
@@ -2633,7 +2495,7 @@
     </w:p>
     <w:tbl>
       <w:tblPr>
-        <w:tblW w:type="dxa" w:w="7938"/>
+        <w:tblW w:type="dxa" w:w="7597"/>
         <w:jc w:val="center"/>
         <w:tblLayout w:type="fixed"/>
         <w:tblLook w:firstColumn="1" w:firstRow="1" w:lastColumn="0" w:lastRow="0" w:noHBand="0" w:noVBand="1" w:val="04A0"/>
@@ -2648,11 +2510,11 @@
         <w:tblLayout w:type="fixed"/>
       </w:tblPr>
       <w:tblGrid>
-        <w:gridCol w:w="1587"/>
-        <w:gridCol w:w="1587"/>
-        <w:gridCol w:w="1587"/>
-        <w:gridCol w:w="1587"/>
-        <w:gridCol w:w="1587"/>
+        <w:gridCol w:w="1871"/>
+        <w:gridCol w:w="850"/>
+        <w:gridCol w:w="1304"/>
+        <w:gridCol w:w="1644"/>
+        <w:gridCol w:w="1927"/>
       </w:tblGrid>
       <w:tr>
         <w:trPr>
@@ -2661,7 +2523,7 @@
         </w:trPr>
         <w:tc>
           <w:tcPr>
-            <w:tcW w:type="dxa" w:w="1587"/>
+            <w:tcW w:type="dxa" w:w="1871"/>
           </w:tcPr>
           <w:p>
             <w:pPr>
@@ -2677,12 +2539,79 @@
                 <w:i w:val="0"/>
                 <w:sz w:val="20"/>
               </w:rPr>
+              <w:t>Model</w:t>
             </w:r>
           </w:p>
         </w:tc>
         <w:tc>
           <w:tcPr>
-            <w:tcW w:type="dxa" w:w="1587"/>
+            <w:tcW w:type="dxa" w:w="850"/>
+          </w:tcPr>
+          <w:p>
+            <w:pPr>
+              <w:spacing w:before="0" w:after="0" w:line="240" w:lineRule="auto"/>
+              <w:ind w:firstLine="0"/>
+              <w:jc w:val="left"/>
+            </w:pPr>
+            <w:r/>
+            <w:r>
+              <w:rPr>
+                <w:rFonts w:ascii="Times New Roman" w:hAnsi="Times New Roman" w:eastAsia="Times New Roman"/>
+                <w:b/>
+                <w:i w:val="0"/>
+                <w:sz w:val="20"/>
+              </w:rPr>
+              <w:t>Tahun</w:t>
+            </w:r>
+          </w:p>
+        </w:tc>
+        <w:tc>
+          <w:tcPr>
+            <w:tcW w:type="dxa" w:w="1304"/>
+          </w:tcPr>
+          <w:p>
+            <w:pPr>
+              <w:spacing w:before="0" w:after="0" w:line="240" w:lineRule="auto"/>
+              <w:ind w:firstLine="0"/>
+              <w:jc w:val="left"/>
+            </w:pPr>
+            <w:r/>
+            <w:r>
+              <w:rPr>
+                <w:rFonts w:ascii="Times New Roman" w:hAnsi="Times New Roman" w:eastAsia="Times New Roman"/>
+                <w:b/>
+                <w:i w:val="0"/>
+                <w:sz w:val="20"/>
+              </w:rPr>
+              <w:t>Ukuran</w:t>
+            </w:r>
+          </w:p>
+        </w:tc>
+        <w:tc>
+          <w:tcPr>
+            <w:tcW w:type="dxa" w:w="1644"/>
+          </w:tcPr>
+          <w:p>
+            <w:pPr>
+              <w:spacing w:before="0" w:after="0" w:line="240" w:lineRule="auto"/>
+              <w:ind w:firstLine="0"/>
+              <w:jc w:val="left"/>
+            </w:pPr>
+            <w:r/>
+            <w:r>
+              <w:rPr>
+                <w:rFonts w:ascii="Times New Roman" w:hAnsi="Times New Roman" w:eastAsia="Times New Roman"/>
+                <w:b/>
+                <w:i w:val="0"/>
+                <w:sz w:val="20"/>
+              </w:rPr>
+              <w:t>Alasan diikutsertakan</w:t>
+            </w:r>
+          </w:p>
+        </w:tc>
+        <w:tc>
+          <w:tcPr>
+            <w:tcW w:type="dxa" w:w="1928"/>
           </w:tcPr>
           <w:p>
             <w:pPr>
@@ -2702,69 +2631,6 @@
             </w:r>
           </w:p>
         </w:tc>
-        <w:tc>
-          <w:tcPr>
-            <w:tcW w:type="dxa" w:w="1587"/>
-          </w:tcPr>
-          <w:p>
-            <w:pPr>
-              <w:spacing w:before="0" w:after="0" w:line="240" w:lineRule="auto"/>
-              <w:ind w:firstLine="0"/>
-              <w:jc w:val="left"/>
-            </w:pPr>
-            <w:r/>
-            <w:r>
-              <w:rPr>
-                <w:rFonts w:ascii="Times New Roman" w:hAnsi="Times New Roman" w:eastAsia="Times New Roman"/>
-                <w:b/>
-                <w:i w:val="0"/>
-                <w:sz w:val="20"/>
-              </w:rPr>
-            </w:r>
-          </w:p>
-        </w:tc>
-        <w:tc>
-          <w:tcPr>
-            <w:tcW w:type="dxa" w:w="1587"/>
-          </w:tcPr>
-          <w:p>
-            <w:pPr>
-              <w:spacing w:before="0" w:after="0" w:line="240" w:lineRule="auto"/>
-              <w:ind w:firstLine="0"/>
-              <w:jc w:val="left"/>
-            </w:pPr>
-            <w:r/>
-            <w:r>
-              <w:rPr>
-                <w:rFonts w:ascii="Times New Roman" w:hAnsi="Times New Roman" w:eastAsia="Times New Roman"/>
-                <w:b/>
-                <w:i w:val="0"/>
-                <w:sz w:val="20"/>
-              </w:rPr>
-            </w:r>
-          </w:p>
-        </w:tc>
-        <w:tc>
-          <w:tcPr>
-            <w:tcW w:type="dxa" w:w="1587"/>
-          </w:tcPr>
-          <w:p>
-            <w:pPr>
-              <w:spacing w:before="0" w:after="0" w:line="240" w:lineRule="auto"/>
-              <w:ind w:firstLine="0"/>
-              <w:jc w:val="left"/>
-            </w:pPr>
-            <w:r/>
-            <w:r>
-              <w:rPr>
-                <w:rFonts w:ascii="Times New Roman" w:hAnsi="Times New Roman" w:eastAsia="Times New Roman"/>
-                <w:b/>
-                <w:i w:val="0"/>
-                <w:sz w:val="20"/>
-              </w:rPr>
-            </w:r>
-          </w:p>
-        </w:tc>
       </w:tr>
       <w:tr>
         <w:trPr>
@@ -2772,7 +2638,7 @@
         </w:trPr>
         <w:tc>
           <w:tcPr>
-            <w:tcW w:type="dxa" w:w="1587"/>
+            <w:tcW w:type="dxa" w:w="1871"/>
           </w:tcPr>
           <w:p>
             <w:pPr>
@@ -2794,7 +2660,7 @@
         </w:tc>
         <w:tc>
           <w:tcPr>
-            <w:tcW w:type="dxa" w:w="1587"/>
+            <w:tcW w:type="dxa" w:w="850"/>
           </w:tcPr>
           <w:p>
             <w:pPr>
@@ -2816,7 +2682,7 @@
         </w:tc>
         <w:tc>
           <w:tcPr>
-            <w:tcW w:type="dxa" w:w="1587"/>
+            <w:tcW w:type="dxa" w:w="1304"/>
           </w:tcPr>
           <w:p>
             <w:pPr>
@@ -2838,54 +2704,7 @@
         </w:tc>
         <w:tc>
           <w:tcPr>
-            <w:tcW w:type="dxa" w:w="1587"/>
-          </w:tcPr>
-          <w:p>
-            <w:pPr>
-              <w:spacing w:before="0" w:after="0" w:line="240" w:lineRule="auto"/>
-              <w:ind w:firstLine="0"/>
-              <w:jc w:val="left"/>
-            </w:pPr>
-            <w:r/>
-            <w:r>
-              <w:rPr>
-                <w:rFonts w:ascii="Times New Roman" w:hAnsi="Times New Roman" w:eastAsia="Times New Roman"/>
-                <w:b w:val="0"/>
-                <w:i w:val="0"/>
-                <w:sz w:val="20"/>
-              </w:rPr>
-            </w:r>
-          </w:p>
-        </w:tc>
-        <w:tc>
-          <w:tcPr>
-            <w:tcW w:type="dxa" w:w="1587"/>
-          </w:tcPr>
-          <w:p>
-            <w:pPr>
-              <w:spacing w:before="0" w:after="0" w:line="240" w:lineRule="auto"/>
-              <w:ind w:firstLine="0"/>
-              <w:jc w:val="left"/>
-            </w:pPr>
-            <w:r/>
-            <w:r>
-              <w:rPr>
-                <w:rFonts w:ascii="Times New Roman" w:hAnsi="Times New Roman" w:eastAsia="Times New Roman"/>
-                <w:b w:val="0"/>
-                <w:i w:val="0"/>
-                <w:sz w:val="20"/>
-              </w:rPr>
-            </w:r>
-          </w:p>
-        </w:tc>
-      </w:tr>
-      <w:tr>
-        <w:trPr>
-          <w:cantSplit/>
-        </w:trPr>
-        <w:tc>
-          <w:tcPr>
-            <w:tcW w:type="dxa" w:w="1587"/>
+            <w:tcW w:type="dxa" w:w="1644"/>
           </w:tcPr>
           <w:p>
             <w:pPr>
@@ -2907,7 +2726,7 @@
         </w:tc>
         <w:tc>
           <w:tcPr>
-            <w:tcW w:type="dxa" w:w="1587"/>
+            <w:tcW w:type="dxa" w:w="1928"/>
           </w:tcPr>
           <w:p>
             <w:pPr>
@@ -2923,69 +2742,7 @@
                 <w:i w:val="0"/>
                 <w:sz w:val="20"/>
               </w:rPr>
-            </w:r>
-          </w:p>
-        </w:tc>
-        <w:tc>
-          <w:tcPr>
-            <w:tcW w:type="dxa" w:w="1587"/>
-          </w:tcPr>
-          <w:p>
-            <w:pPr>
-              <w:spacing w:before="0" w:after="0" w:line="240" w:lineRule="auto"/>
-              <w:ind w:firstLine="0"/>
-              <w:jc w:val="left"/>
-            </w:pPr>
-            <w:r/>
-            <w:r>
-              <w:rPr>
-                <w:rFonts w:ascii="Times New Roman" w:hAnsi="Times New Roman" w:eastAsia="Times New Roman"/>
-                <w:b w:val="0"/>
-                <w:i w:val="0"/>
-                <w:sz w:val="20"/>
-              </w:rPr>
-            </w:r>
-          </w:p>
-        </w:tc>
-        <w:tc>
-          <w:tcPr>
-            <w:tcW w:type="dxa" w:w="1587"/>
-          </w:tcPr>
-          <w:p>
-            <w:pPr>
-              <w:spacing w:before="0" w:after="0" w:line="240" w:lineRule="auto"/>
-              <w:ind w:firstLine="0"/>
-              <w:jc w:val="left"/>
-            </w:pPr>
-            <w:r/>
-            <w:r>
-              <w:rPr>
-                <w:rFonts w:ascii="Times New Roman" w:hAnsi="Times New Roman" w:eastAsia="Times New Roman"/>
-                <w:b w:val="0"/>
-                <w:i w:val="0"/>
-                <w:sz w:val="20"/>
-              </w:rPr>
-            </w:r>
-          </w:p>
-        </w:tc>
-        <w:tc>
-          <w:tcPr>
-            <w:tcW w:type="dxa" w:w="1587"/>
-          </w:tcPr>
-          <w:p>
-            <w:pPr>
-              <w:spacing w:before="0" w:after="0" w:line="240" w:lineRule="auto"/>
-              <w:ind w:firstLine="0"/>
-              <w:jc w:val="left"/>
-            </w:pPr>
-            <w:r/>
-            <w:r>
-              <w:rPr>
-                <w:rFonts w:ascii="Times New Roman" w:hAnsi="Times New Roman" w:eastAsia="Times New Roman"/>
-                <w:b w:val="0"/>
-                <w:i w:val="0"/>
-                <w:sz w:val="20"/>
-              </w:rPr>
+              <w:t>Kandidat utama; tiga tingkat dibandingkan</w:t>
             </w:r>
           </w:p>
         </w:tc>
@@ -2996,7 +2753,7 @@
         </w:trPr>
         <w:tc>
           <w:tcPr>
-            <w:tcW w:type="dxa" w:w="1587"/>
+            <w:tcW w:type="dxa" w:w="1871"/>
           </w:tcPr>
           <w:p>
             <w:pPr>
@@ -3018,7 +2775,7 @@
         </w:tc>
         <w:tc>
           <w:tcPr>
-            <w:tcW w:type="dxa" w:w="1587"/>
+            <w:tcW w:type="dxa" w:w="850"/>
           </w:tcPr>
           <w:p>
             <w:pPr>
@@ -3040,7 +2797,7 @@
         </w:tc>
         <w:tc>
           <w:tcPr>
-            <w:tcW w:type="dxa" w:w="1587"/>
+            <w:tcW w:type="dxa" w:w="1304"/>
           </w:tcPr>
           <w:p>
             <w:pPr>
@@ -3062,7 +2819,7 @@
         </w:tc>
         <w:tc>
           <w:tcPr>
-            <w:tcW w:type="dxa" w:w="1587"/>
+            <w:tcW w:type="dxa" w:w="1644"/>
           </w:tcPr>
           <w:p>
             <w:pPr>
@@ -3078,61 +2835,13 @@
                 <w:i w:val="0"/>
                 <w:sz w:val="20"/>
               </w:rPr>
-              <w:t>Generasi sebelumnya dari keluarga yang</w:t>
+              <w:t>Generasi sebelumnya dari keluarga yang sama</w:t>
             </w:r>
           </w:p>
         </w:tc>
         <w:tc>
           <w:tcPr>
-            <w:tcW w:type="dxa" w:w="1587"/>
-          </w:tcPr>
-          <w:p>
-            <w:pPr>
-              <w:spacing w:before="0" w:after="0" w:line="240" w:lineRule="auto"/>
-              <w:ind w:firstLine="0"/>
-              <w:jc w:val="left"/>
-            </w:pPr>
-            <w:r/>
-            <w:r>
-              <w:rPr>
-                <w:rFonts w:ascii="Times New Roman" w:hAnsi="Times New Roman" w:eastAsia="Times New Roman"/>
-                <w:b w:val="0"/>
-                <w:i w:val="0"/>
-                <w:sz w:val="20"/>
-              </w:rPr>
-            </w:r>
-          </w:p>
-        </w:tc>
-      </w:tr>
-      <w:tr>
-        <w:trPr>
-          <w:cantSplit/>
-        </w:trPr>
-        <w:tc>
-          <w:tcPr>
-            <w:tcW w:type="dxa" w:w="1587"/>
-          </w:tcPr>
-          <w:p>
-            <w:pPr>
-              <w:spacing w:before="0" w:after="0" w:line="240" w:lineRule="auto"/>
-              <w:ind w:firstLine="0"/>
-              <w:jc w:val="left"/>
-            </w:pPr>
-            <w:r/>
-            <w:r>
-              <w:rPr>
-                <w:rFonts w:ascii="Times New Roman" w:hAnsi="Times New Roman" w:eastAsia="Times New Roman"/>
-                <w:b w:val="0"/>
-                <w:i w:val="0"/>
-                <w:sz w:val="20"/>
-              </w:rPr>
-              <w:t>sama</w:t>
-            </w:r>
-          </w:p>
-        </w:tc>
-        <w:tc>
-          <w:tcPr>
-            <w:tcW w:type="dxa" w:w="1587"/>
+            <w:tcW w:type="dxa" w:w="1928"/>
           </w:tcPr>
           <w:p>
             <w:pPr>
@@ -3152,69 +2861,6 @@
             </w:r>
           </w:p>
         </w:tc>
-        <w:tc>
-          <w:tcPr>
-            <w:tcW w:type="dxa" w:w="1587"/>
-          </w:tcPr>
-          <w:p>
-            <w:pPr>
-              <w:spacing w:before="0" w:after="0" w:line="240" w:lineRule="auto"/>
-              <w:ind w:firstLine="0"/>
-              <w:jc w:val="left"/>
-            </w:pPr>
-            <w:r/>
-            <w:r>
-              <w:rPr>
-                <w:rFonts w:ascii="Times New Roman" w:hAnsi="Times New Roman" w:eastAsia="Times New Roman"/>
-                <w:b w:val="0"/>
-                <w:i w:val="0"/>
-                <w:sz w:val="20"/>
-              </w:rPr>
-            </w:r>
-          </w:p>
-        </w:tc>
-        <w:tc>
-          <w:tcPr>
-            <w:tcW w:type="dxa" w:w="1587"/>
-          </w:tcPr>
-          <w:p>
-            <w:pPr>
-              <w:spacing w:before="0" w:after="0" w:line="240" w:lineRule="auto"/>
-              <w:ind w:firstLine="0"/>
-              <w:jc w:val="left"/>
-            </w:pPr>
-            <w:r/>
-            <w:r>
-              <w:rPr>
-                <w:rFonts w:ascii="Times New Roman" w:hAnsi="Times New Roman" w:eastAsia="Times New Roman"/>
-                <w:b w:val="0"/>
-                <w:i w:val="0"/>
-                <w:sz w:val="20"/>
-              </w:rPr>
-            </w:r>
-          </w:p>
-        </w:tc>
-        <w:tc>
-          <w:tcPr>
-            <w:tcW w:type="dxa" w:w="1587"/>
-          </w:tcPr>
-          <w:p>
-            <w:pPr>
-              <w:spacing w:before="0" w:after="0" w:line="240" w:lineRule="auto"/>
-              <w:ind w:firstLine="0"/>
-              <w:jc w:val="left"/>
-            </w:pPr>
-            <w:r/>
-            <w:r>
-              <w:rPr>
-                <w:rFonts w:ascii="Times New Roman" w:hAnsi="Times New Roman" w:eastAsia="Times New Roman"/>
-                <w:b w:val="0"/>
-                <w:i w:val="0"/>
-                <w:sz w:val="20"/>
-              </w:rPr>
-            </w:r>
-          </w:p>
-        </w:tc>
       </w:tr>
       <w:tr>
         <w:trPr>
@@ -3222,7 +2868,7 @@
         </w:trPr>
         <w:tc>
           <w:tcPr>
-            <w:tcW w:type="dxa" w:w="1587"/>
+            <w:tcW w:type="dxa" w:w="1871"/>
           </w:tcPr>
           <w:p>
             <w:pPr>
@@ -3244,7 +2890,7 @@
         </w:tc>
         <w:tc>
           <w:tcPr>
-            <w:tcW w:type="dxa" w:w="1587"/>
+            <w:tcW w:type="dxa" w:w="850"/>
           </w:tcPr>
           <w:p>
             <w:pPr>
@@ -3266,7 +2912,7 @@
         </w:tc>
         <w:tc>
           <w:tcPr>
-            <w:tcW w:type="dxa" w:w="1587"/>
+            <w:tcW w:type="dxa" w:w="1304"/>
           </w:tcPr>
           <w:p>
             <w:pPr>
@@ -3288,7 +2934,7 @@
         </w:tc>
         <w:tc>
           <w:tcPr>
-            <w:tcW w:type="dxa" w:w="1587"/>
+            <w:tcW w:type="dxa" w:w="1644"/>
           </w:tcPr>
           <w:p>
             <w:pPr>
@@ -3304,61 +2950,13 @@
                 <w:i w:val="0"/>
                 <w:sz w:val="20"/>
               </w:rPr>
-              <w:t>Arsitektur acuan pada domain ini dan dipakai</w:t>
+              <w:t>Arsitektur acuan pada domain ini dan dipakai penelitian terdahulu</w:t>
             </w:r>
           </w:p>
         </w:tc>
         <w:tc>
           <w:tcPr>
-            <w:tcW w:type="dxa" w:w="1587"/>
-          </w:tcPr>
-          <w:p>
-            <w:pPr>
-              <w:spacing w:before="0" w:after="0" w:line="240" w:lineRule="auto"/>
-              <w:ind w:firstLine="0"/>
-              <w:jc w:val="left"/>
-            </w:pPr>
-            <w:r/>
-            <w:r>
-              <w:rPr>
-                <w:rFonts w:ascii="Times New Roman" w:hAnsi="Times New Roman" w:eastAsia="Times New Roman"/>
-                <w:b w:val="0"/>
-                <w:i w:val="0"/>
-                <w:sz w:val="20"/>
-              </w:rPr>
-            </w:r>
-          </w:p>
-        </w:tc>
-      </w:tr>
-      <w:tr>
-        <w:trPr>
-          <w:cantSplit/>
-        </w:trPr>
-        <w:tc>
-          <w:tcPr>
-            <w:tcW w:type="dxa" w:w="1587"/>
-          </w:tcPr>
-          <w:p>
-            <w:pPr>
-              <w:spacing w:before="0" w:after="0" w:line="240" w:lineRule="auto"/>
-              <w:ind w:firstLine="0"/>
-              <w:jc w:val="left"/>
-            </w:pPr>
-            <w:r/>
-            <w:r>
-              <w:rPr>
-                <w:rFonts w:ascii="Times New Roman" w:hAnsi="Times New Roman" w:eastAsia="Times New Roman"/>
-                <w:b w:val="0"/>
-                <w:i w:val="0"/>
-                <w:sz w:val="20"/>
-              </w:rPr>
-              <w:t>penelitian terdahulu</w:t>
-            </w:r>
-          </w:p>
-        </w:tc>
-        <w:tc>
-          <w:tcPr>
-            <w:tcW w:type="dxa" w:w="1587"/>
+            <w:tcW w:type="dxa" w:w="1928"/>
           </w:tcPr>
           <w:p>
             <w:pPr>
@@ -3378,69 +2976,6 @@
             </w:r>
           </w:p>
         </w:tc>
-        <w:tc>
-          <w:tcPr>
-            <w:tcW w:type="dxa" w:w="1587"/>
-          </w:tcPr>
-          <w:p>
-            <w:pPr>
-              <w:spacing w:before="0" w:after="0" w:line="240" w:lineRule="auto"/>
-              <w:ind w:firstLine="0"/>
-              <w:jc w:val="left"/>
-            </w:pPr>
-            <w:r/>
-            <w:r>
-              <w:rPr>
-                <w:rFonts w:ascii="Times New Roman" w:hAnsi="Times New Roman" w:eastAsia="Times New Roman"/>
-                <w:b w:val="0"/>
-                <w:i w:val="0"/>
-                <w:sz w:val="20"/>
-              </w:rPr>
-            </w:r>
-          </w:p>
-        </w:tc>
-        <w:tc>
-          <w:tcPr>
-            <w:tcW w:type="dxa" w:w="1587"/>
-          </w:tcPr>
-          <w:p>
-            <w:pPr>
-              <w:spacing w:before="0" w:after="0" w:line="240" w:lineRule="auto"/>
-              <w:ind w:firstLine="0"/>
-              <w:jc w:val="left"/>
-            </w:pPr>
-            <w:r/>
-            <w:r>
-              <w:rPr>
-                <w:rFonts w:ascii="Times New Roman" w:hAnsi="Times New Roman" w:eastAsia="Times New Roman"/>
-                <w:b w:val="0"/>
-                <w:i w:val="0"/>
-                <w:sz w:val="20"/>
-              </w:rPr>
-            </w:r>
-          </w:p>
-        </w:tc>
-        <w:tc>
-          <w:tcPr>
-            <w:tcW w:type="dxa" w:w="1587"/>
-          </w:tcPr>
-          <w:p>
-            <w:pPr>
-              <w:spacing w:before="0" w:after="0" w:line="240" w:lineRule="auto"/>
-              <w:ind w:firstLine="0"/>
-              <w:jc w:val="left"/>
-            </w:pPr>
-            <w:r/>
-            <w:r>
-              <w:rPr>
-                <w:rFonts w:ascii="Times New Roman" w:hAnsi="Times New Roman" w:eastAsia="Times New Roman"/>
-                <w:b w:val="0"/>
-                <w:i w:val="0"/>
-                <w:sz w:val="20"/>
-              </w:rPr>
-            </w:r>
-          </w:p>
-        </w:tc>
       </w:tr>
       <w:tr>
         <w:trPr>
@@ -3448,7 +2983,7 @@
         </w:trPr>
         <w:tc>
           <w:tcPr>
-            <w:tcW w:type="dxa" w:w="1587"/>
+            <w:tcW w:type="dxa" w:w="1871"/>
           </w:tcPr>
           <w:p>
             <w:pPr>
@@ -3470,7 +3005,7 @@
         </w:tc>
         <w:tc>
           <w:tcPr>
-            <w:tcW w:type="dxa" w:w="1587"/>
+            <w:tcW w:type="dxa" w:w="850"/>
           </w:tcPr>
           <w:p>
             <w:pPr>
@@ -3492,7 +3027,7 @@
         </w:tc>
         <w:tc>
           <w:tcPr>
-            <w:tcW w:type="dxa" w:w="1587"/>
+            <w:tcW w:type="dxa" w:w="1304"/>
           </w:tcPr>
           <w:p>
             <w:pPr>
@@ -3514,7 +3049,7 @@
         </w:tc>
         <w:tc>
           <w:tcPr>
-            <w:tcW w:type="dxa" w:w="1587"/>
+            <w:tcW w:type="dxa" w:w="1644"/>
           </w:tcPr>
           <w:p>
             <w:pPr>
@@ -3530,13 +3065,13 @@
                 <w:i w:val="0"/>
                 <w:sz w:val="20"/>
               </w:rPr>
-              <w:t>Kombinasi</w:t>
+              <w:t>Kombinasi detektor-pengenal terbaik pada kumpulan data tujuh segmen</w:t>
             </w:r>
           </w:p>
         </w:tc>
         <w:tc>
           <w:tcPr>
-            <w:tcW w:type="dxa" w:w="1587"/>
+            <w:tcW w:type="dxa" w:w="1928"/>
           </w:tcPr>
           <w:p>
             <w:pPr>
@@ -3552,6 +3087,7 @@
                 <w:i w:val="0"/>
                 <w:sz w:val="20"/>
               </w:rPr>
+              <w:t>Pembanding pipeline dua tahap</w:t>
             </w:r>
           </w:p>
         </w:tc>
@@ -3562,118 +3098,7 @@
         </w:trPr>
         <w:tc>
           <w:tcPr>
-            <w:tcW w:type="dxa" w:w="1587"/>
-          </w:tcPr>
-          <w:p>
-            <w:pPr>
-              <w:spacing w:before="0" w:after="0" w:line="240" w:lineRule="auto"/>
-              <w:ind w:firstLine="0"/>
-              <w:jc w:val="left"/>
-            </w:pPr>
-            <w:r/>
-            <w:r>
-              <w:rPr>
-                <w:rFonts w:ascii="Times New Roman" w:hAnsi="Times New Roman" w:eastAsia="Times New Roman"/>
-                <w:b w:val="0"/>
-                <w:i w:val="0"/>
-                <w:sz w:val="20"/>
-              </w:rPr>
-              <w:t>detektor-pengenal terbaik pada kumpulan data tujuh segmen</w:t>
-            </w:r>
-          </w:p>
-        </w:tc>
-        <w:tc>
-          <w:tcPr>
-            <w:tcW w:type="dxa" w:w="1587"/>
-          </w:tcPr>
-          <w:p>
-            <w:pPr>
-              <w:spacing w:before="0" w:after="0" w:line="240" w:lineRule="auto"/>
-              <w:ind w:firstLine="0"/>
-              <w:jc w:val="left"/>
-            </w:pPr>
-            <w:r/>
-            <w:r>
-              <w:rPr>
-                <w:rFonts w:ascii="Times New Roman" w:hAnsi="Times New Roman" w:eastAsia="Times New Roman"/>
-                <w:b w:val="0"/>
-                <w:i w:val="0"/>
-                <w:sz w:val="20"/>
-              </w:rPr>
-            </w:r>
-          </w:p>
-        </w:tc>
-        <w:tc>
-          <w:tcPr>
-            <w:tcW w:type="dxa" w:w="1587"/>
-          </w:tcPr>
-          <w:p>
-            <w:pPr>
-              <w:spacing w:before="0" w:after="0" w:line="240" w:lineRule="auto"/>
-              <w:ind w:firstLine="0"/>
-              <w:jc w:val="left"/>
-            </w:pPr>
-            <w:r/>
-            <w:r>
-              <w:rPr>
-                <w:rFonts w:ascii="Times New Roman" w:hAnsi="Times New Roman" w:eastAsia="Times New Roman"/>
-                <w:b w:val="0"/>
-                <w:i w:val="0"/>
-                <w:sz w:val="20"/>
-              </w:rPr>
-            </w:r>
-          </w:p>
-        </w:tc>
-        <w:tc>
-          <w:tcPr>
-            <w:tcW w:type="dxa" w:w="1587"/>
-          </w:tcPr>
-          <w:p>
-            <w:pPr>
-              <w:spacing w:before="0" w:after="0" w:line="240" w:lineRule="auto"/>
-              <w:ind w:firstLine="0"/>
-              <w:jc w:val="left"/>
-            </w:pPr>
-            <w:r/>
-            <w:r>
-              <w:rPr>
-                <w:rFonts w:ascii="Times New Roman" w:hAnsi="Times New Roman" w:eastAsia="Times New Roman"/>
-                <w:b w:val="0"/>
-                <w:i w:val="0"/>
-                <w:sz w:val="20"/>
-              </w:rPr>
-            </w:r>
-          </w:p>
-        </w:tc>
-        <w:tc>
-          <w:tcPr>
-            <w:tcW w:type="dxa" w:w="1587"/>
-          </w:tcPr>
-          <w:p>
-            <w:pPr>
-              <w:spacing w:before="0" w:after="0" w:line="240" w:lineRule="auto"/>
-              <w:ind w:firstLine="0"/>
-              <w:jc w:val="left"/>
-            </w:pPr>
-            <w:r/>
-            <w:r>
-              <w:rPr>
-                <w:rFonts w:ascii="Times New Roman" w:hAnsi="Times New Roman" w:eastAsia="Times New Roman"/>
-                <w:b w:val="0"/>
-                <w:i w:val="0"/>
-                <w:sz w:val="20"/>
-              </w:rPr>
-            </w:r>
-          </w:p>
-        </w:tc>
-      </w:tr>
-      <w:tr>
-        <w:trPr>
-          <w:cantSplit/>
-        </w:trPr>
-        <w:tc>
-          <w:tcPr>
-            <w:tcW w:type="dxa" w:w="1587"/>
+            <w:tcW w:type="dxa" w:w="1871"/>
           </w:tcPr>
           <w:p>
             <w:pPr>
@@ -3695,7 +3120,7 @@
         </w:tc>
         <w:tc>
           <w:tcPr>
-            <w:tcW w:type="dxa" w:w="1587"/>
+            <w:tcW w:type="dxa" w:w="850"/>
           </w:tcPr>
           <w:p>
             <w:pPr>
@@ -3717,7 +3142,7 @@
         </w:tc>
         <w:tc>
           <w:tcPr>
-            <w:tcW w:type="dxa" w:w="1587"/>
+            <w:tcW w:type="dxa" w:w="1304"/>
           </w:tcPr>
           <w:p>
             <w:pPr>
@@ -3739,7 +3164,7 @@
         </w:tc>
         <w:tc>
           <w:tcPr>
-            <w:tcW w:type="dxa" w:w="1587"/>
+            <w:tcW w:type="dxa" w:w="1644"/>
           </w:tcPr>
           <w:p>
             <w:pPr>
@@ -3761,7 +3186,7 @@
         </w:tc>
         <w:tc>
           <w:tcPr>
-            <w:tcW w:type="dxa" w:w="1587"/>
+            <w:tcW w:type="dxa" w:w="1928"/>
           </w:tcPr>
           <w:p>
             <w:pPr>
@@ -3777,7 +3202,7 @@
                 <w:i w:val="0"/>
                 <w:sz w:val="20"/>
               </w:rPr>
-              <w:t>Pembanding non-machine learning; menguji apakah pembelajaran mendalam memang</w:t>
+              <w:t>Pembanding non-machine learning; menguji apakah pembelajaran mendalam memang unggul</w:t>
             </w:r>
           </w:p>
         </w:tc>
@@ -3788,7 +3213,7 @@
         </w:trPr>
         <w:tc>
           <w:tcPr>
-            <w:tcW w:type="dxa" w:w="1587"/>
+            <w:tcW w:type="dxa" w:w="1871"/>
           </w:tcPr>
           <w:p>
             <w:pPr>
@@ -3810,7 +3235,7 @@
         </w:tc>
         <w:tc>
           <w:tcPr>
-            <w:tcW w:type="dxa" w:w="1587"/>
+            <w:tcW w:type="dxa" w:w="850"/>
           </w:tcPr>
           <w:p>
             <w:pPr>
@@ -3832,7 +3257,7 @@
         </w:tc>
         <w:tc>
           <w:tcPr>
-            <w:tcW w:type="dxa" w:w="1587"/>
+            <w:tcW w:type="dxa" w:w="1304"/>
           </w:tcPr>
           <w:p>
             <w:pPr>
@@ -3854,7 +3279,7 @@
         </w:tc>
         <w:tc>
           <w:tcPr>
-            <w:tcW w:type="dxa" w:w="1587"/>
+            <w:tcW w:type="dxa" w:w="1644"/>
           </w:tcPr>
           <w:p>
             <w:pPr>
@@ -3876,7 +3301,7 @@
         </w:tc>
         <w:tc>
           <w:tcPr>
-            <w:tcW w:type="dxa" w:w="1587"/>
+            <w:tcW w:type="dxa" w:w="1928"/>
           </w:tcPr>
           <w:p>
             <w:pPr>
@@ -3892,6 +3317,7 @@
                 <w:i w:val="0"/>
                 <w:sz w:val="20"/>
               </w:rPr>
+              <w:t>Pembanding biaya</w:t>
             </w:r>
           </w:p>
         </w:tc>
@@ -4253,7 +3679,7 @@
       <w:r>
         <w:drawing>
           <wp:inline xmlns:a="http://schemas.openxmlformats.org/drawingml/2006/main" xmlns:pic="http://schemas.openxmlformats.org/drawingml/2006/picture">
-            <wp:extent cx="4464000" cy="7317830"/>
+            <wp:extent cx="4464000" cy="6564250"/>
             <wp:docPr id="1" name="Picture 1"/>
             <wp:cNvGraphicFramePr>
               <a:graphicFrameLocks noChangeAspect="1"/>
@@ -4274,7 +3700,7 @@
                   <pic:spPr>
                     <a:xfrm>
                       <a:off x="0" y="0"/>
-                      <a:ext cx="4464000" cy="7317830"/>
+                      <a:ext cx="4464000" cy="6564250"/>
                     </a:xfrm>
                     <a:prstGeom prst="rect"/>
                   </pic:spPr>
@@ -4334,7 +3760,7 @@
     </w:p>
     <w:tbl>
       <w:tblPr>
-        <w:tblW w:type="dxa" w:w="7938"/>
+        <w:tblW w:type="dxa" w:w="7597"/>
         <w:jc w:val="center"/>
         <w:tblLayout w:type="fixed"/>
         <w:tblLook w:firstColumn="1" w:firstRow="1" w:lastColumn="0" w:lastRow="0" w:noHBand="0" w:noVBand="1" w:val="04A0"/>
@@ -4349,10 +3775,10 @@
         <w:tblLayout w:type="fixed"/>
       </w:tblPr>
       <w:tblGrid>
-        <w:gridCol w:w="1984"/>
-        <w:gridCol w:w="1984"/>
-        <w:gridCol w:w="1984"/>
-        <w:gridCol w:w="1984"/>
+        <w:gridCol w:w="1871"/>
+        <w:gridCol w:w="1927"/>
+        <w:gridCol w:w="1927"/>
+        <w:gridCol w:w="1871"/>
       </w:tblGrid>
       <w:tr>
         <w:trPr>
@@ -4361,7 +3787,7 @@
         </w:trPr>
         <w:tc>
           <w:tcPr>
-            <w:tcW w:type="dxa" w:w="1984"/>
+            <w:tcW w:type="dxa" w:w="1871"/>
           </w:tcPr>
           <w:p>
             <w:pPr>
@@ -4377,13 +3803,13 @@
                 <w:i w:val="0"/>
                 <w:sz w:val="20"/>
               </w:rPr>
-              <w:t>Akuisisi</w:t>
+              <w:t>Blok</w:t>
             </w:r>
           </w:p>
         </w:tc>
         <w:tc>
           <w:tcPr>
-            <w:tcW w:type="dxa" w:w="1984"/>
+            <w:tcW w:type="dxa" w:w="1928"/>
           </w:tcPr>
           <w:p>
             <w:pPr>
@@ -4399,13 +3825,13 @@
                 <w:i w:val="0"/>
                 <w:sz w:val="20"/>
               </w:rPr>
-              <w:t>Foto atau 3–5 bingkai video</w:t>
+              <w:t>Masukan</w:t>
             </w:r>
           </w:p>
         </w:tc>
         <w:tc>
           <w:tcPr>
-            <w:tcW w:type="dxa" w:w="1984"/>
+            <w:tcW w:type="dxa" w:w="1928"/>
           </w:tcPr>
           <w:p>
             <w:pPr>
@@ -4421,13 +3847,13 @@
                 <w:i w:val="0"/>
                 <w:sz w:val="20"/>
               </w:rPr>
-              <w:t>Citra dan metadata kondisi</w:t>
+              <w:t>Keluaran</w:t>
             </w:r>
           </w:p>
         </w:tc>
         <w:tc>
           <w:tcPr>
-            <w:tcW w:type="dxa" w:w="1984"/>
+            <w:tcW w:type="dxa" w:w="1871"/>
           </w:tcPr>
           <w:p>
             <w:pPr>
@@ -4443,7 +3869,7 @@
                 <w:i w:val="0"/>
                 <w:sz w:val="20"/>
               </w:rPr>
-              <w:t>Lapis</w:t>
+              <w:t>Alasan</w:t>
             </w:r>
           </w:p>
         </w:tc>
@@ -4454,7 +3880,100 @@
         </w:trPr>
         <w:tc>
           <w:tcPr>
-            <w:tcW w:type="dxa" w:w="1984"/>
+            <w:tcW w:type="dxa" w:w="1871"/>
+          </w:tcPr>
+          <w:p>
+            <w:pPr>
+              <w:spacing w:before="0" w:after="0" w:line="240" w:lineRule="auto"/>
+              <w:ind w:firstLine="0"/>
+              <w:jc w:val="left"/>
+            </w:pPr>
+            <w:r/>
+            <w:r>
+              <w:rPr>
+                <w:rFonts w:ascii="Times New Roman" w:hAnsi="Times New Roman" w:eastAsia="Times New Roman"/>
+                <w:b w:val="0"/>
+                <w:i w:val="0"/>
+                <w:sz w:val="20"/>
+              </w:rPr>
+              <w:t>Akuisisi</w:t>
+            </w:r>
+          </w:p>
+        </w:tc>
+        <w:tc>
+          <w:tcPr>
+            <w:tcW w:type="dxa" w:w="1928"/>
+          </w:tcPr>
+          <w:p>
+            <w:pPr>
+              <w:spacing w:before="0" w:after="0" w:line="240" w:lineRule="auto"/>
+              <w:ind w:firstLine="0"/>
+              <w:jc w:val="left"/>
+            </w:pPr>
+            <w:r/>
+            <w:r>
+              <w:rPr>
+                <w:rFonts w:ascii="Times New Roman" w:hAnsi="Times New Roman" w:eastAsia="Times New Roman"/>
+                <w:b w:val="0"/>
+                <w:i w:val="0"/>
+                <w:sz w:val="20"/>
+              </w:rPr>
+              <w:t>Foto atau 3–5 bingkai video</w:t>
+            </w:r>
+          </w:p>
+        </w:tc>
+        <w:tc>
+          <w:tcPr>
+            <w:tcW w:type="dxa" w:w="1928"/>
+          </w:tcPr>
+          <w:p>
+            <w:pPr>
+              <w:spacing w:before="0" w:after="0" w:line="240" w:lineRule="auto"/>
+              <w:ind w:firstLine="0"/>
+              <w:jc w:val="left"/>
+            </w:pPr>
+            <w:r/>
+            <w:r>
+              <w:rPr>
+                <w:rFonts w:ascii="Times New Roman" w:hAnsi="Times New Roman" w:eastAsia="Times New Roman"/>
+                <w:b w:val="0"/>
+                <w:i w:val="0"/>
+                <w:sz w:val="20"/>
+              </w:rPr>
+              <w:t>Citra dan metadata kondisi</w:t>
+            </w:r>
+          </w:p>
+        </w:tc>
+        <w:tc>
+          <w:tcPr>
+            <w:tcW w:type="dxa" w:w="1871"/>
+          </w:tcPr>
+          <w:p>
+            <w:pPr>
+              <w:spacing w:before="0" w:after="0" w:line="240" w:lineRule="auto"/>
+              <w:ind w:firstLine="0"/>
+              <w:jc w:val="left"/>
+            </w:pPr>
+            <w:r/>
+            <w:r>
+              <w:rPr>
+                <w:rFonts w:ascii="Times New Roman" w:hAnsi="Times New Roman" w:eastAsia="Times New Roman"/>
+                <w:b w:val="0"/>
+                <w:i w:val="0"/>
+                <w:sz w:val="20"/>
+              </w:rPr>
+              <w:t>Lapis temporal memerlukan beberapa bingkai; metadata dipakai untuk analisis per kondisi</w:t>
+            </w:r>
+          </w:p>
+        </w:tc>
+      </w:tr>
+      <w:tr>
+        <w:trPr>
+          <w:cantSplit/>
+        </w:trPr>
+        <w:tc>
+          <w:tcPr>
+            <w:tcW w:type="dxa" w:w="1871"/>
           </w:tcPr>
           <w:p>
             <w:pPr>
@@ -4476,7 +3995,7 @@
         </w:tc>
         <w:tc>
           <w:tcPr>
-            <w:tcW w:type="dxa" w:w="1984"/>
+            <w:tcW w:type="dxa" w:w="1928"/>
           </w:tcPr>
           <w:p>
             <w:pPr>
@@ -4498,7 +4017,7 @@
         </w:tc>
         <w:tc>
           <w:tcPr>
-            <w:tcW w:type="dxa" w:w="1984"/>
+            <w:tcW w:type="dxa" w:w="1928"/>
           </w:tcPr>
           <w:p>
             <w:pPr>
@@ -4520,7 +4039,7 @@
         </w:tc>
         <w:tc>
           <w:tcPr>
-            <w:tcW w:type="dxa" w:w="1984"/>
+            <w:tcW w:type="dxa" w:w="1871"/>
           </w:tcPr>
           <w:p>
             <w:pPr>
@@ -4536,7 +4055,7 @@
                 <w:i w:val="0"/>
                 <w:sz w:val="20"/>
               </w:rPr>
-              <w:t>Menyamakan kontras LED dan</w:t>
+              <w:t>Menyamakan kontras LED dan LCD pasif serta mengurangi gangguan latar</w:t>
             </w:r>
           </w:p>
         </w:tc>
@@ -4547,7 +4066,7 @@
         </w:trPr>
         <w:tc>
           <w:tcPr>
-            <w:tcW w:type="dxa" w:w="1984"/>
+            <w:tcW w:type="dxa" w:w="1871"/>
           </w:tcPr>
           <w:p>
             <w:pPr>
@@ -4569,7 +4088,7 @@
         </w:tc>
         <w:tc>
           <w:tcPr>
-            <w:tcW w:type="dxa" w:w="1984"/>
+            <w:tcW w:type="dxa" w:w="1928"/>
           </w:tcPr>
           <w:p>
             <w:pPr>
@@ -4591,7 +4110,7 @@
         </w:tc>
         <w:tc>
           <w:tcPr>
-            <w:tcW w:type="dxa" w:w="1984"/>
+            <w:tcW w:type="dxa" w:w="1928"/>
           </w:tcPr>
           <w:p>
             <w:pPr>
@@ -4613,7 +4132,7 @@
         </w:tc>
         <w:tc>
           <w:tcPr>
-            <w:tcW w:type="dxa" w:w="1984"/>
+            <w:tcW w:type="dxa" w:w="1871"/>
           </w:tcPr>
           <w:p>
             <w:pPr>
@@ -4629,7 +4148,7 @@
                 <w:i w:val="0"/>
                 <w:sz w:val="20"/>
               </w:rPr>
-              <w:t>Enam model dijalankan pada</w:t>
+              <w:t>Enam model dijalankan pada citra yang sama</w:t>
             </w:r>
           </w:p>
         </w:tc>
@@ -4640,7 +4159,7 @@
         </w:trPr>
         <w:tc>
           <w:tcPr>
-            <w:tcW w:type="dxa" w:w="1984"/>
+            <w:tcW w:type="dxa" w:w="1871"/>
           </w:tcPr>
           <w:p>
             <w:pPr>
@@ -4662,7 +4181,7 @@
         </w:tc>
         <w:tc>
           <w:tcPr>
-            <w:tcW w:type="dxa" w:w="1984"/>
+            <w:tcW w:type="dxa" w:w="1928"/>
           </w:tcPr>
           <w:p>
             <w:pPr>
@@ -4684,7 +4203,7 @@
         </w:tc>
         <w:tc>
           <w:tcPr>
-            <w:tcW w:type="dxa" w:w="1984"/>
+            <w:tcW w:type="dxa" w:w="1928"/>
           </w:tcPr>
           <w:p>
             <w:pPr>
@@ -4706,54 +4225,7 @@
         </w:tc>
         <w:tc>
           <w:tcPr>
-            <w:tcW w:type="dxa" w:w="1984"/>
-          </w:tcPr>
-          <w:p>
-            <w:pPr>
-              <w:spacing w:before="0" w:after="0" w:line="240" w:lineRule="auto"/>
-              <w:ind w:firstLine="0"/>
-              <w:jc w:val="left"/>
-            </w:pPr>
-            <w:r/>
-            <w:r>
-              <w:rPr>
-                <w:rFonts w:ascii="Times New Roman" w:hAnsi="Times New Roman" w:eastAsia="Times New Roman"/>
-                <w:b w:val="0"/>
-                <w:i w:val="0"/>
-                <w:sz w:val="20"/>
-              </w:rPr>
-            </w:r>
-          </w:p>
-        </w:tc>
-      </w:tr>
-      <w:tr>
-        <w:trPr>
-          <w:cantSplit/>
-        </w:trPr>
-        <w:tc>
-          <w:tcPr>
-            <w:tcW w:type="dxa" w:w="1984"/>
-          </w:tcPr>
-          <w:p>
-            <w:pPr>
-              <w:spacing w:before="0" w:after="0" w:line="240" w:lineRule="auto"/>
-              <w:ind w:firstLine="0"/>
-              <w:jc w:val="left"/>
-            </w:pPr>
-            <w:r/>
-            <w:r>
-              <w:rPr>
-                <w:rFonts w:ascii="Times New Roman" w:hAnsi="Times New Roman" w:eastAsia="Times New Roman"/>
-                <w:b w:val="0"/>
-                <w:i w:val="0"/>
-                <w:sz w:val="20"/>
-              </w:rPr>
-            </w:r>
-          </w:p>
-        </w:tc>
-        <w:tc>
-          <w:tcPr>
-            <w:tcW w:type="dxa" w:w="1984"/>
+            <w:tcW w:type="dxa" w:w="1871"/>
           </w:tcPr>
           <w:p>
             <w:pPr>
@@ -4773,48 +4245,6 @@
             </w:r>
           </w:p>
         </w:tc>
-        <w:tc>
-          <w:tcPr>
-            <w:tcW w:type="dxa" w:w="1984"/>
-          </w:tcPr>
-          <w:p>
-            <w:pPr>
-              <w:spacing w:before="0" w:after="0" w:line="240" w:lineRule="auto"/>
-              <w:ind w:firstLine="0"/>
-              <w:jc w:val="left"/>
-            </w:pPr>
-            <w:r/>
-            <w:r>
-              <w:rPr>
-                <w:rFonts w:ascii="Times New Roman" w:hAnsi="Times New Roman" w:eastAsia="Times New Roman"/>
-                <w:b w:val="0"/>
-                <w:i w:val="0"/>
-                <w:sz w:val="20"/>
-              </w:rPr>
-            </w:r>
-          </w:p>
-        </w:tc>
-        <w:tc>
-          <w:tcPr>
-            <w:tcW w:type="dxa" w:w="1984"/>
-          </w:tcPr>
-          <w:p>
-            <w:pPr>
-              <w:spacing w:before="0" w:after="0" w:line="240" w:lineRule="auto"/>
-              <w:ind w:firstLine="0"/>
-              <w:jc w:val="left"/>
-            </w:pPr>
-            <w:r/>
-            <w:r>
-              <w:rPr>
-                <w:rFonts w:ascii="Times New Roman" w:hAnsi="Times New Roman" w:eastAsia="Times New Roman"/>
-                <w:b w:val="0"/>
-                <w:i w:val="0"/>
-                <w:sz w:val="20"/>
-              </w:rPr>
-            </w:r>
-          </w:p>
-        </w:tc>
       </w:tr>
       <w:tr>
         <w:trPr>
@@ -4822,7 +4252,7 @@
         </w:trPr>
         <w:tc>
           <w:tcPr>
-            <w:tcW w:type="dxa" w:w="1984"/>
+            <w:tcW w:type="dxa" w:w="1871"/>
           </w:tcPr>
           <w:p>
             <w:pPr>
@@ -4844,7 +4274,7 @@
         </w:tc>
         <w:tc>
           <w:tcPr>
-            <w:tcW w:type="dxa" w:w="1984"/>
+            <w:tcW w:type="dxa" w:w="1928"/>
           </w:tcPr>
           <w:p>
             <w:pPr>
@@ -4866,7 +4296,7 @@
         </w:tc>
         <w:tc>
           <w:tcPr>
-            <w:tcW w:type="dxa" w:w="1984"/>
+            <w:tcW w:type="dxa" w:w="1928"/>
           </w:tcPr>
           <w:p>
             <w:pPr>
@@ -4888,7 +4318,7 @@
         </w:tc>
         <w:tc>
           <w:tcPr>
-            <w:tcW w:type="dxa" w:w="1984"/>
+            <w:tcW w:type="dxa" w:w="1871"/>
           </w:tcPr>
           <w:p>
             <w:pPr>
@@ -4915,7 +4345,7 @@
         </w:trPr>
         <w:tc>
           <w:tcPr>
-            <w:tcW w:type="dxa" w:w="1984"/>
+            <w:tcW w:type="dxa" w:w="1871"/>
           </w:tcPr>
           <w:p>
             <w:pPr>
@@ -4937,7 +4367,7 @@
         </w:tc>
         <w:tc>
           <w:tcPr>
-            <w:tcW w:type="dxa" w:w="1984"/>
+            <w:tcW w:type="dxa" w:w="1928"/>
           </w:tcPr>
           <w:p>
             <w:pPr>
@@ -4959,7 +4389,7 @@
         </w:tc>
         <w:tc>
           <w:tcPr>
-            <w:tcW w:type="dxa" w:w="1984"/>
+            <w:tcW w:type="dxa" w:w="1928"/>
           </w:tcPr>
           <w:p>
             <w:pPr>
@@ -4981,7 +4411,7 @@
         </w:tc>
         <w:tc>
           <w:tcPr>
-            <w:tcW w:type="dxa" w:w="1984"/>
+            <w:tcW w:type="dxa" w:w="1871"/>
           </w:tcPr>
           <w:p>
             <w:pPr>
@@ -4997,7 +4427,7 @@
                 <w:i w:val="0"/>
                 <w:sz w:val="20"/>
               </w:rPr>
-              <w:t>Menekan</w:t>
+              <w:t>Menekan kesalahan senyap memakai konteks di luar citra</w:t>
             </w:r>
           </w:p>
         </w:tc>
@@ -5008,7 +4438,7 @@
         </w:trPr>
         <w:tc>
           <w:tcPr>
-            <w:tcW w:type="dxa" w:w="1984"/>
+            <w:tcW w:type="dxa" w:w="1871"/>
           </w:tcPr>
           <w:p>
             <w:pPr>
@@ -5030,7 +4460,7 @@
         </w:tc>
         <w:tc>
           <w:tcPr>
-            <w:tcW w:type="dxa" w:w="1984"/>
+            <w:tcW w:type="dxa" w:w="1928"/>
           </w:tcPr>
           <w:p>
             <w:pPr>
@@ -5052,7 +4482,7 @@
         </w:tc>
         <w:tc>
           <w:tcPr>
-            <w:tcW w:type="dxa" w:w="1984"/>
+            <w:tcW w:type="dxa" w:w="1928"/>
           </w:tcPr>
           <w:p>
             <w:pPr>
@@ -5068,13 +4498,13 @@
                 <w:i w:val="0"/>
                 <w:sz w:val="20"/>
               </w:rPr>
-              <w:t>Kesalahan senyap, coverage,</w:t>
+              <w:t>Kesalahan senyap, coverage, selective accuracy, AURC</w:t>
             </w:r>
           </w:p>
         </w:tc>
         <w:tc>
           <w:tcPr>
-            <w:tcW w:type="dxa" w:w="1984"/>
+            <w:tcW w:type="dxa" w:w="1871"/>
           </w:tcPr>
           <w:p>
             <w:pPr>
@@ -5090,6 +4520,7 @@
                 <w:i w:val="0"/>
                 <w:sz w:val="20"/>
               </w:rPr>
+              <w:t>Ukuran keandalan, bukan sekadar akurasi</w:t>
             </w:r>
           </w:p>
         </w:tc>
@@ -5239,7 +4670,7 @@
     </w:p>
     <w:tbl>
       <w:tblPr>
-        <w:tblW w:type="dxa" w:w="7938"/>
+        <w:tblW w:type="dxa" w:w="7597"/>
         <w:jc w:val="center"/>
         <w:tblLayout w:type="fixed"/>
         <w:tblLook w:firstColumn="1" w:firstRow="1" w:lastColumn="0" w:lastRow="0" w:noHBand="0" w:noVBand="1" w:val="04A0"/>
@@ -5254,9 +4685,9 @@
         <w:tblLayout w:type="fixed"/>
       </w:tblPr>
       <w:tblGrid>
-        <w:gridCol w:w="2646"/>
-        <w:gridCol w:w="2646"/>
-        <w:gridCol w:w="2646"/>
+        <w:gridCol w:w="567"/>
+        <w:gridCol w:w="3061"/>
+        <w:gridCol w:w="3969"/>
       </w:tblGrid>
       <w:tr>
         <w:trPr>
@@ -5265,7 +4696,7 @@
         </w:trPr>
         <w:tc>
           <w:tcPr>
-            <w:tcW w:type="dxa" w:w="2646"/>
+            <w:tcW w:type="dxa" w:w="567"/>
           </w:tcPr>
           <w:p>
             <w:pPr>
@@ -5281,13 +4712,13 @@
                 <w:i w:val="0"/>
                 <w:sz w:val="20"/>
               </w:rPr>
-              <w:t>A1</w:t>
+              <w:t>Kode</w:t>
             </w:r>
           </w:p>
         </w:tc>
         <w:tc>
           <w:tcPr>
-            <w:tcW w:type="dxa" w:w="2646"/>
+            <w:tcW w:type="dxa" w:w="3061"/>
           </w:tcPr>
           <w:p>
             <w:pPr>
@@ -5303,13 +4734,13 @@
                 <w:i w:val="0"/>
                 <w:sz w:val="20"/>
               </w:rPr>
-              <w:t>PP-OCRv6 tiny, small, medium tanpa adaptasi</w:t>
+              <w:t>Konfigurasi</w:t>
             </w:r>
           </w:p>
         </w:tc>
         <w:tc>
           <w:tcPr>
-            <w:tcW w:type="dxa" w:w="2646"/>
+            <w:tcW w:type="dxa" w:w="3969"/>
           </w:tcPr>
           <w:p>
             <w:pPr>
@@ -5325,6 +4756,7 @@
                 <w:i w:val="0"/>
                 <w:sz w:val="20"/>
               </w:rPr>
+              <w:t>Pertanyaan yang dijawab</w:t>
             </w:r>
           </w:p>
         </w:tc>
@@ -5335,7 +4767,78 @@
         </w:trPr>
         <w:tc>
           <w:tcPr>
-            <w:tcW w:type="dxa" w:w="2646"/>
+            <w:tcW w:type="dxa" w:w="567"/>
+          </w:tcPr>
+          <w:p>
+            <w:pPr>
+              <w:spacing w:before="0" w:after="0" w:line="240" w:lineRule="auto"/>
+              <w:ind w:firstLine="0"/>
+              <w:jc w:val="left"/>
+            </w:pPr>
+            <w:r/>
+            <w:r>
+              <w:rPr>
+                <w:rFonts w:ascii="Times New Roman" w:hAnsi="Times New Roman" w:eastAsia="Times New Roman"/>
+                <w:b w:val="0"/>
+                <w:i w:val="0"/>
+                <w:sz w:val="20"/>
+              </w:rPr>
+              <w:t>A1</w:t>
+            </w:r>
+          </w:p>
+        </w:tc>
+        <w:tc>
+          <w:tcPr>
+            <w:tcW w:type="dxa" w:w="3061"/>
+          </w:tcPr>
+          <w:p>
+            <w:pPr>
+              <w:spacing w:before="0" w:after="0" w:line="240" w:lineRule="auto"/>
+              <w:ind w:firstLine="0"/>
+              <w:jc w:val="left"/>
+            </w:pPr>
+            <w:r/>
+            <w:r>
+              <w:rPr>
+                <w:rFonts w:ascii="Times New Roman" w:hAnsi="Times New Roman" w:eastAsia="Times New Roman"/>
+                <w:b w:val="0"/>
+                <w:i w:val="0"/>
+                <w:sz w:val="20"/>
+              </w:rPr>
+              <w:t>PP-OCRv6 tiny, small, medium tanpa adaptasi</w:t>
+            </w:r>
+          </w:p>
+        </w:tc>
+        <w:tc>
+          <w:tcPr>
+            <w:tcW w:type="dxa" w:w="3969"/>
+          </w:tcPr>
+          <w:p>
+            <w:pPr>
+              <w:spacing w:before="0" w:after="0" w:line="240" w:lineRule="auto"/>
+              <w:ind w:firstLine="0"/>
+              <w:jc w:val="left"/>
+            </w:pPr>
+            <w:r/>
+            <w:r>
+              <w:rPr>
+                <w:rFonts w:ascii="Times New Roman" w:hAnsi="Times New Roman" w:eastAsia="Times New Roman"/>
+                <w:b w:val="0"/>
+                <w:i w:val="0"/>
+                <w:sz w:val="20"/>
+              </w:rPr>
+              <w:t>Sejauh mana kemampuan tanpa adaptasi, dan tingkat mana yang paling efisien?</w:t>
+            </w:r>
+          </w:p>
+        </w:tc>
+      </w:tr>
+      <w:tr>
+        <w:trPr>
+          <w:cantSplit/>
+        </w:trPr>
+        <w:tc>
+          <w:tcPr>
+            <w:tcW w:type="dxa" w:w="567"/>
           </w:tcPr>
           <w:p>
             <w:pPr>
@@ -5357,7 +4860,7 @@
         </w:tc>
         <w:tc>
           <w:tcPr>
-            <w:tcW w:type="dxa" w:w="2646"/>
+            <w:tcW w:type="dxa" w:w="3061"/>
           </w:tcPr>
           <w:p>
             <w:pPr>
@@ -5379,7 +4882,7 @@
         </w:tc>
         <w:tc>
           <w:tcPr>
-            <w:tcW w:type="dxa" w:w="2646"/>
+            <w:tcW w:type="dxa" w:w="3969"/>
           </w:tcPr>
           <w:p>
             <w:pPr>
@@ -5395,7 +4898,7 @@
                 <w:i w:val="0"/>
                 <w:sz w:val="20"/>
               </w:rPr>
-              <w:t>Apakah kenaikan generasi memberi manfaat nyata</w:t>
+              <w:t>Apakah kenaikan generasi memberi manfaat nyata pada domain ini?</w:t>
             </w:r>
           </w:p>
         </w:tc>
@@ -5406,7 +4909,7 @@
         </w:trPr>
         <w:tc>
           <w:tcPr>
-            <w:tcW w:type="dxa" w:w="2646"/>
+            <w:tcW w:type="dxa" w:w="567"/>
           </w:tcPr>
           <w:p>
             <w:pPr>
@@ -5428,7 +4931,7 @@
         </w:tc>
         <w:tc>
           <w:tcPr>
-            <w:tcW w:type="dxa" w:w="2646"/>
+            <w:tcW w:type="dxa" w:w="3061"/>
           </w:tcPr>
           <w:p>
             <w:pPr>
@@ -5450,7 +4953,7 @@
         </w:tc>
         <w:tc>
           <w:tcPr>
-            <w:tcW w:type="dxa" w:w="2646"/>
+            <w:tcW w:type="dxa" w:w="3969"/>
           </w:tcPr>
           <w:p>
             <w:pPr>
@@ -5466,7 +4969,7 @@
                 <w:i w:val="0"/>
                 <w:sz w:val="20"/>
               </w:rPr>
-              <w:t>Seberapa jauh model khusus</w:t>
+              <w:t>Seberapa jauh model khusus kalah atau menang?</w:t>
             </w:r>
           </w:p>
         </w:tc>
@@ -5477,7 +4980,7 @@
         </w:trPr>
         <w:tc>
           <w:tcPr>
-            <w:tcW w:type="dxa" w:w="2646"/>
+            <w:tcW w:type="dxa" w:w="567"/>
           </w:tcPr>
           <w:p>
             <w:pPr>
@@ -5499,7 +5002,7 @@
         </w:tc>
         <w:tc>
           <w:tcPr>
-            <w:tcW w:type="dxa" w:w="2646"/>
+            <w:tcW w:type="dxa" w:w="3061"/>
           </w:tcPr>
           <w:p>
             <w:pPr>
@@ -5521,7 +5024,7 @@
         </w:tc>
         <w:tc>
           <w:tcPr>
-            <w:tcW w:type="dxa" w:w="2646"/>
+            <w:tcW w:type="dxa" w:w="3969"/>
           </w:tcPr>
           <w:p>
             <w:pPr>
@@ -5537,7 +5040,7 @@
                 <w:i w:val="0"/>
                 <w:sz w:val="20"/>
               </w:rPr>
-              <w:t>Apakah pipeline dua tahap lebih baik daripada satu model</w:t>
+              <w:t>Apakah pipeline dua tahap lebih baik daripada satu model terpadu?</w:t>
             </w:r>
           </w:p>
         </w:tc>
@@ -5548,7 +5051,7 @@
         </w:trPr>
         <w:tc>
           <w:tcPr>
-            <w:tcW w:type="dxa" w:w="2646"/>
+            <w:tcW w:type="dxa" w:w="567"/>
           </w:tcPr>
           <w:p>
             <w:pPr>
@@ -5570,7 +5073,7 @@
         </w:tc>
         <w:tc>
           <w:tcPr>
-            <w:tcW w:type="dxa" w:w="2646"/>
+            <w:tcW w:type="dxa" w:w="3061"/>
           </w:tcPr>
           <w:p>
             <w:pPr>
@@ -5592,7 +5095,7 @@
         </w:tc>
         <w:tc>
           <w:tcPr>
-            <w:tcW w:type="dxa" w:w="2646"/>
+            <w:tcW w:type="dxa" w:w="3969"/>
           </w:tcPr>
           <w:p>
             <w:pPr>
@@ -5619,7 +5122,7 @@
         </w:trPr>
         <w:tc>
           <w:tcPr>
-            <w:tcW w:type="dxa" w:w="2646"/>
+            <w:tcW w:type="dxa" w:w="567"/>
           </w:tcPr>
           <w:p>
             <w:pPr>
@@ -5641,7 +5144,7 @@
         </w:tc>
         <w:tc>
           <w:tcPr>
-            <w:tcW w:type="dxa" w:w="2646"/>
+            <w:tcW w:type="dxa" w:w="3061"/>
           </w:tcPr>
           <w:p>
             <w:pPr>
@@ -5663,7 +5166,7 @@
         </w:tc>
         <w:tc>
           <w:tcPr>
-            <w:tcW w:type="dxa" w:w="2646"/>
+            <w:tcW w:type="dxa" w:w="3969"/>
           </w:tcPr>
           <w:p>
             <w:pPr>
@@ -5679,7 +5182,7 @@
                 <w:i w:val="0"/>
                 <w:sz w:val="20"/>
               </w:rPr>
-              <w:t>Berapa biaya yang harus</w:t>
+              <w:t>Berapa biaya yang harus dibayar untuk akurasi setara?</w:t>
             </w:r>
           </w:p>
         </w:tc>
@@ -5719,7 +5222,7 @@
     </w:p>
     <w:tbl>
       <w:tblPr>
-        <w:tblW w:type="dxa" w:w="7938"/>
+        <w:tblW w:type="dxa" w:w="7597"/>
         <w:jc w:val="center"/>
         <w:tblLayout w:type="fixed"/>
         <w:tblLook w:firstColumn="1" w:firstRow="1" w:lastColumn="0" w:lastRow="0" w:noHBand="0" w:noVBand="1" w:val="04A0"/>
@@ -5734,9 +5237,9 @@
         <w:tblLayout w:type="fixed"/>
       </w:tblPr>
       <w:tblGrid>
-        <w:gridCol w:w="2646"/>
-        <w:gridCol w:w="2646"/>
-        <w:gridCol w:w="2646"/>
+        <w:gridCol w:w="567"/>
+        <w:gridCol w:w="3061"/>
+        <w:gridCol w:w="3969"/>
       </w:tblGrid>
       <w:tr>
         <w:trPr>
@@ -5745,7 +5248,7 @@
         </w:trPr>
         <w:tc>
           <w:tcPr>
-            <w:tcW w:type="dxa" w:w="2646"/>
+            <w:tcW w:type="dxa" w:w="567"/>
           </w:tcPr>
           <w:p>
             <w:pPr>
@@ -5761,13 +5264,13 @@
                 <w:i w:val="0"/>
                 <w:sz w:val="20"/>
               </w:rPr>
-              <w:t>B1</w:t>
+              <w:t>Kode</w:t>
             </w:r>
           </w:p>
         </w:tc>
         <w:tc>
           <w:tcPr>
-            <w:tcW w:type="dxa" w:w="2646"/>
+            <w:tcW w:type="dxa" w:w="3061"/>
           </w:tcPr>
           <w:p>
             <w:pPr>
@@ -5783,13 +5286,13 @@
                 <w:i w:val="0"/>
                 <w:sz w:val="20"/>
               </w:rPr>
-              <w:t>Model terpilih, tanpa verifikasi</w:t>
+              <w:t>Konfigurasi</w:t>
             </w:r>
           </w:p>
         </w:tc>
         <w:tc>
           <w:tcPr>
-            <w:tcW w:type="dxa" w:w="2646"/>
+            <w:tcW w:type="dxa" w:w="3969"/>
           </w:tcPr>
           <w:p>
             <w:pPr>
@@ -5805,7 +5308,7 @@
                 <w:i w:val="0"/>
                 <w:sz w:val="20"/>
               </w:rPr>
-              <w:t>Berapa kesalahan senyap pada kondisi</w:t>
+              <w:t>Pertanyaan yang dijawab</w:t>
             </w:r>
           </w:p>
         </w:tc>
@@ -5816,7 +5319,78 @@
         </w:trPr>
         <w:tc>
           <w:tcPr>
-            <w:tcW w:type="dxa" w:w="2646"/>
+            <w:tcW w:type="dxa" w:w="567"/>
+          </w:tcPr>
+          <w:p>
+            <w:pPr>
+              <w:spacing w:before="0" w:after="0" w:line="240" w:lineRule="auto"/>
+              <w:ind w:firstLine="0"/>
+              <w:jc w:val="left"/>
+            </w:pPr>
+            <w:r/>
+            <w:r>
+              <w:rPr>
+                <w:rFonts w:ascii="Times New Roman" w:hAnsi="Times New Roman" w:eastAsia="Times New Roman"/>
+                <w:b w:val="0"/>
+                <w:i w:val="0"/>
+                <w:sz w:val="20"/>
+              </w:rPr>
+              <w:t>B1</w:t>
+            </w:r>
+          </w:p>
+        </w:tc>
+        <w:tc>
+          <w:tcPr>
+            <w:tcW w:type="dxa" w:w="3061"/>
+          </w:tcPr>
+          <w:p>
+            <w:pPr>
+              <w:spacing w:before="0" w:after="0" w:line="240" w:lineRule="auto"/>
+              <w:ind w:firstLine="0"/>
+              <w:jc w:val="left"/>
+            </w:pPr>
+            <w:r/>
+            <w:r>
+              <w:rPr>
+                <w:rFonts w:ascii="Times New Roman" w:hAnsi="Times New Roman" w:eastAsia="Times New Roman"/>
+                <w:b w:val="0"/>
+                <w:i w:val="0"/>
+                <w:sz w:val="20"/>
+              </w:rPr>
+              <w:t>Model terpilih, tanpa verifikasi</w:t>
+            </w:r>
+          </w:p>
+        </w:tc>
+        <w:tc>
+          <w:tcPr>
+            <w:tcW w:type="dxa" w:w="3969"/>
+          </w:tcPr>
+          <w:p>
+            <w:pPr>
+              <w:spacing w:before="0" w:after="0" w:line="240" w:lineRule="auto"/>
+              <w:ind w:firstLine="0"/>
+              <w:jc w:val="left"/>
+            </w:pPr>
+            <w:r/>
+            <w:r>
+              <w:rPr>
+                <w:rFonts w:ascii="Times New Roman" w:hAnsi="Times New Roman" w:eastAsia="Times New Roman"/>
+                <w:b w:val="0"/>
+                <w:i w:val="0"/>
+                <w:sz w:val="20"/>
+              </w:rPr>
+              <w:t>Berapa kesalahan senyap pada kondisi dasar?</w:t>
+            </w:r>
+          </w:p>
+        </w:tc>
+      </w:tr>
+      <w:tr>
+        <w:trPr>
+          <w:cantSplit/>
+        </w:trPr>
+        <w:tc>
+          <w:tcPr>
+            <w:tcW w:type="dxa" w:w="567"/>
           </w:tcPr>
           <w:p>
             <w:pPr>
@@ -5838,7 +5412,7 @@
         </w:tc>
         <w:tc>
           <w:tcPr>
-            <w:tcW w:type="dxa" w:w="2646"/>
+            <w:tcW w:type="dxa" w:w="3061"/>
           </w:tcPr>
           <w:p>
             <w:pPr>
@@ -5860,7 +5434,7 @@
         </w:tc>
         <w:tc>
           <w:tcPr>
-            <w:tcW w:type="dxa" w:w="2646"/>
+            <w:tcW w:type="dxa" w:w="3969"/>
           </w:tcPr>
           <w:p>
             <w:pPr>
@@ -5876,7 +5450,7 @@
                 <w:i w:val="0"/>
                 <w:sz w:val="20"/>
               </w:rPr>
-              <w:t>Berapa kesalahan senyap yang tertangkap oleh</w:t>
+              <w:t>Berapa kesalahan senyap yang tertangkap oleh pemeriksaan bentuk?</w:t>
             </w:r>
           </w:p>
         </w:tc>
@@ -5887,7 +5461,7 @@
         </w:trPr>
         <w:tc>
           <w:tcPr>
-            <w:tcW w:type="dxa" w:w="2646"/>
+            <w:tcW w:type="dxa" w:w="567"/>
           </w:tcPr>
           <w:p>
             <w:pPr>
@@ -5909,7 +5483,7 @@
         </w:tc>
         <w:tc>
           <w:tcPr>
-            <w:tcW w:type="dxa" w:w="2646"/>
+            <w:tcW w:type="dxa" w:w="3061"/>
           </w:tcPr>
           <w:p>
             <w:pPr>
@@ -5931,7 +5505,7 @@
         </w:tc>
         <w:tc>
           <w:tcPr>
-            <w:tcW w:type="dxa" w:w="2646"/>
+            <w:tcW w:type="dxa" w:w="3969"/>
           </w:tcPr>
           <w:p>
             <w:pPr>
@@ -5958,7 +5532,7 @@
         </w:trPr>
         <w:tc>
           <w:tcPr>
-            <w:tcW w:type="dxa" w:w="2646"/>
+            <w:tcW w:type="dxa" w:w="567"/>
           </w:tcPr>
           <w:p>
             <w:pPr>
@@ -5980,7 +5554,7 @@
         </w:tc>
         <w:tc>
           <w:tcPr>
-            <w:tcW w:type="dxa" w:w="2646"/>
+            <w:tcW w:type="dxa" w:w="3061"/>
           </w:tcPr>
           <w:p>
             <w:pPr>
@@ -6002,7 +5576,7 @@
         </w:tc>
         <w:tc>
           <w:tcPr>
-            <w:tcW w:type="dxa" w:w="2646"/>
+            <w:tcW w:type="dxa" w:w="3969"/>
           </w:tcPr>
           <w:p>
             <w:pPr>
@@ -6018,7 +5592,7 @@
                 <w:i w:val="0"/>
                 <w:sz w:val="20"/>
               </w:rPr>
-              <w:t>Tambahan manfaat dari kesepakatan antar</w:t>
+              <w:t>Tambahan manfaat dari kesepakatan antar bingkai?</w:t>
             </w:r>
           </w:p>
         </w:tc>
@@ -6029,7 +5603,7 @@
         </w:trPr>
         <w:tc>
           <w:tcPr>
-            <w:tcW w:type="dxa" w:w="2646"/>
+            <w:tcW w:type="dxa" w:w="567"/>
           </w:tcPr>
           <w:p>
             <w:pPr>
@@ -6051,7 +5625,7 @@
         </w:tc>
         <w:tc>
           <w:tcPr>
-            <w:tcW w:type="dxa" w:w="2646"/>
+            <w:tcW w:type="dxa" w:w="3061"/>
           </w:tcPr>
           <w:p>
             <w:pPr>
@@ -6073,7 +5647,7 @@
         </w:tc>
         <w:tc>
           <w:tcPr>
-            <w:tcW w:type="dxa" w:w="2646"/>
+            <w:tcW w:type="dxa" w:w="3969"/>
           </w:tcPr>
           <w:p>
             <w:pPr>
@@ -6089,7 +5663,7 @@
                 <w:i w:val="0"/>
                 <w:sz w:val="20"/>
               </w:rPr>
-              <w:t>Di mana titik seimbang antara</w:t>
+              <w:t>Di mana titik seimbang antara coverage dan akurasi?</w:t>
             </w:r>
           </w:p>
         </w:tc>
@@ -6287,7 +5861,7 @@
     </w:p>
     <w:tbl>
       <w:tblPr>
-        <w:tblW w:type="dxa" w:w="7938"/>
+        <w:tblW w:type="dxa" w:w="7597"/>
         <w:jc w:val="center"/>
         <w:tblLayout w:type="fixed"/>
         <w:tblLook w:firstColumn="1" w:firstRow="1" w:lastColumn="0" w:lastRow="0" w:noHBand="0" w:noVBand="1" w:val="04A0"/>
@@ -6302,9 +5876,9 @@
         <w:tblLayout w:type="fixed"/>
       </w:tblPr>
       <w:tblGrid>
-        <w:gridCol w:w="2646"/>
-        <w:gridCol w:w="2646"/>
-        <w:gridCol w:w="2646"/>
+        <w:gridCol w:w="1020"/>
+        <w:gridCol w:w="3402"/>
+        <w:gridCol w:w="3175"/>
       </w:tblGrid>
       <w:tr>
         <w:trPr>
@@ -6313,7 +5887,7 @@
         </w:trPr>
         <w:tc>
           <w:tcPr>
-            <w:tcW w:type="dxa" w:w="2646"/>
+            <w:tcW w:type="dxa" w:w="1020"/>
           </w:tcPr>
           <w:p>
             <w:pPr>
@@ -6329,13 +5903,13 @@
                 <w:i w:val="0"/>
                 <w:sz w:val="20"/>
               </w:rPr>
-              <w:t>1</w:t>
+              <w:t>Minggu</w:t>
             </w:r>
           </w:p>
         </w:tc>
         <w:tc>
           <w:tcPr>
-            <w:tcW w:type="dxa" w:w="2646"/>
+            <w:tcW w:type="dxa" w:w="3402"/>
           </w:tcPr>
           <w:p>
             <w:pPr>
@@ -6351,13 +5925,13 @@
                 <w:i w:val="0"/>
                 <w:sz w:val="20"/>
               </w:rPr>
-              <w:t>Spesifikasi data, metrik, dan ambang keberhasilan</w:t>
+              <w:t>Pekerjaan</w:t>
             </w:r>
           </w:p>
         </w:tc>
         <w:tc>
           <w:tcPr>
-            <w:tcW w:type="dxa" w:w="2646"/>
+            <w:tcW w:type="dxa" w:w="3175"/>
           </w:tcPr>
           <w:p>
             <w:pPr>
@@ -6373,6 +5947,77 @@
                 <w:i w:val="0"/>
                 <w:sz w:val="20"/>
               </w:rPr>
+              <w:t>Luaran</w:t>
+            </w:r>
+          </w:p>
+        </w:tc>
+      </w:tr>
+      <w:tr>
+        <w:trPr>
+          <w:cantSplit/>
+        </w:trPr>
+        <w:tc>
+          <w:tcPr>
+            <w:tcW w:type="dxa" w:w="1020"/>
+          </w:tcPr>
+          <w:p>
+            <w:pPr>
+              <w:spacing w:before="0" w:after="0" w:line="240" w:lineRule="auto"/>
+              <w:ind w:firstLine="0"/>
+              <w:jc w:val="left"/>
+            </w:pPr>
+            <w:r/>
+            <w:r>
+              <w:rPr>
+                <w:rFonts w:ascii="Times New Roman" w:hAnsi="Times New Roman" w:eastAsia="Times New Roman"/>
+                <w:b w:val="0"/>
+                <w:i w:val="0"/>
+                <w:sz w:val="20"/>
+              </w:rPr>
+              <w:t>1</w:t>
+            </w:r>
+          </w:p>
+        </w:tc>
+        <w:tc>
+          <w:tcPr>
+            <w:tcW w:type="dxa" w:w="3402"/>
+          </w:tcPr>
+          <w:p>
+            <w:pPr>
+              <w:spacing w:before="0" w:after="0" w:line="240" w:lineRule="auto"/>
+              <w:ind w:firstLine="0"/>
+              <w:jc w:val="left"/>
+            </w:pPr>
+            <w:r/>
+            <w:r>
+              <w:rPr>
+                <w:rFonts w:ascii="Times New Roman" w:hAnsi="Times New Roman" w:eastAsia="Times New Roman"/>
+                <w:b w:val="0"/>
+                <w:i w:val="0"/>
+                <w:sz w:val="20"/>
+              </w:rPr>
+              <w:t>Spesifikasi data, metrik, dan ambang keberhasilan</w:t>
+            </w:r>
+          </w:p>
+        </w:tc>
+        <w:tc>
+          <w:tcPr>
+            <w:tcW w:type="dxa" w:w="3175"/>
+          </w:tcPr>
+          <w:p>
+            <w:pPr>
+              <w:spacing w:before="0" w:after="0" w:line="240" w:lineRule="auto"/>
+              <w:ind w:firstLine="0"/>
+              <w:jc w:val="left"/>
+            </w:pPr>
+            <w:r/>
+            <w:r>
+              <w:rPr>
+                <w:rFonts w:ascii="Times New Roman" w:hAnsi="Times New Roman" w:eastAsia="Times New Roman"/>
+                <w:b w:val="0"/>
+                <w:i w:val="0"/>
+                <w:sz w:val="20"/>
+              </w:rPr>
               <w:t>Dokumen spesifikasi</w:t>
             </w:r>
           </w:p>
@@ -6384,7 +6029,7 @@
         </w:trPr>
         <w:tc>
           <w:tcPr>
-            <w:tcW w:type="dxa" w:w="2646"/>
+            <w:tcW w:type="dxa" w:w="1020"/>
           </w:tcPr>
           <w:p>
             <w:pPr>
@@ -6406,7 +6051,7 @@
         </w:tc>
         <w:tc>
           <w:tcPr>
-            <w:tcW w:type="dxa" w:w="2646"/>
+            <w:tcW w:type="dxa" w:w="3402"/>
           </w:tcPr>
           <w:p>
             <w:pPr>
@@ -6428,7 +6073,7 @@
         </w:tc>
         <w:tc>
           <w:tcPr>
-            <w:tcW w:type="dxa" w:w="2646"/>
+            <w:tcW w:type="dxa" w:w="3175"/>
           </w:tcPr>
           <w:p>
             <w:pPr>
@@ -6444,7 +6089,7 @@
                 <w:i w:val="0"/>
                 <w:sz w:val="20"/>
               </w:rPr>
-              <w:t>Data latih dan</w:t>
+              <w:t>Data latih dan data uji sintetis</w:t>
             </w:r>
           </w:p>
         </w:tc>
@@ -6455,7 +6100,7 @@
         </w:trPr>
         <w:tc>
           <w:tcPr>
-            <w:tcW w:type="dxa" w:w="2646"/>
+            <w:tcW w:type="dxa" w:w="1020"/>
           </w:tcPr>
           <w:p>
             <w:pPr>
@@ -6477,7 +6122,7 @@
         </w:tc>
         <w:tc>
           <w:tcPr>
-            <w:tcW w:type="dxa" w:w="2646"/>
+            <w:tcW w:type="dxa" w:w="3402"/>
           </w:tcPr>
           <w:p>
             <w:pPr>
@@ -6499,7 +6144,7 @@
         </w:tc>
         <w:tc>
           <w:tcPr>
-            <w:tcW w:type="dxa" w:w="2646"/>
+            <w:tcW w:type="dxa" w:w="3175"/>
           </w:tcPr>
           <w:p>
             <w:pPr>
@@ -6526,7 +6171,7 @@
         </w:trPr>
         <w:tc>
           <w:tcPr>
-            <w:tcW w:type="dxa" w:w="2646"/>
+            <w:tcW w:type="dxa" w:w="1020"/>
           </w:tcPr>
           <w:p>
             <w:pPr>
@@ -6548,7 +6193,7 @@
         </w:tc>
         <w:tc>
           <w:tcPr>
-            <w:tcW w:type="dxa" w:w="2646"/>
+            <w:tcW w:type="dxa" w:w="3402"/>
           </w:tcPr>
           <w:p>
             <w:pPr>
@@ -6570,7 +6215,7 @@
         </w:tc>
         <w:tc>
           <w:tcPr>
-            <w:tcW w:type="dxa" w:w="2646"/>
+            <w:tcW w:type="dxa" w:w="3175"/>
           </w:tcPr>
           <w:p>
             <w:pPr>
@@ -6597,7 +6242,7 @@
         </w:trPr>
         <w:tc>
           <w:tcPr>
-            <w:tcW w:type="dxa" w:w="2646"/>
+            <w:tcW w:type="dxa" w:w="1020"/>
           </w:tcPr>
           <w:p>
             <w:pPr>
@@ -6619,7 +6264,7 @@
         </w:tc>
         <w:tc>
           <w:tcPr>
-            <w:tcW w:type="dxa" w:w="2646"/>
+            <w:tcW w:type="dxa" w:w="3402"/>
           </w:tcPr>
           <w:p>
             <w:pPr>
@@ -6641,7 +6286,7 @@
         </w:tc>
         <w:tc>
           <w:tcPr>
-            <w:tcW w:type="dxa" w:w="2646"/>
+            <w:tcW w:type="dxa" w:w="3175"/>
           </w:tcPr>
           <w:p>
             <w:pPr>
@@ -6668,7 +6313,7 @@
         </w:trPr>
         <w:tc>
           <w:tcPr>
-            <w:tcW w:type="dxa" w:w="2646"/>
+            <w:tcW w:type="dxa" w:w="1020"/>
           </w:tcPr>
           <w:p>
             <w:pPr>
@@ -6690,7 +6335,7 @@
         </w:tc>
         <w:tc>
           <w:tcPr>
-            <w:tcW w:type="dxa" w:w="2646"/>
+            <w:tcW w:type="dxa" w:w="3402"/>
           </w:tcPr>
           <w:p>
             <w:pPr>
@@ -6712,7 +6357,7 @@
         </w:tc>
         <w:tc>
           <w:tcPr>
-            <w:tcW w:type="dxa" w:w="2646"/>
+            <w:tcW w:type="dxa" w:w="3175"/>
           </w:tcPr>
           <w:p>
             <w:pPr>
@@ -6739,7 +6384,7 @@
         </w:trPr>
         <w:tc>
           <w:tcPr>
-            <w:tcW w:type="dxa" w:w="2646"/>
+            <w:tcW w:type="dxa" w:w="1020"/>
           </w:tcPr>
           <w:p>
             <w:pPr>
@@ -6761,7 +6406,7 @@
         </w:tc>
         <w:tc>
           <w:tcPr>
-            <w:tcW w:type="dxa" w:w="2646"/>
+            <w:tcW w:type="dxa" w:w="3402"/>
           </w:tcPr>
           <w:p>
             <w:pPr>
@@ -6783,7 +6428,7 @@
         </w:tc>
         <w:tc>
           <w:tcPr>
-            <w:tcW w:type="dxa" w:w="2646"/>
+            <w:tcW w:type="dxa" w:w="3175"/>
           </w:tcPr>
           <w:p>
             <w:pPr>
@@ -6810,7 +6455,7 @@
         </w:trPr>
         <w:tc>
           <w:tcPr>
-            <w:tcW w:type="dxa" w:w="2646"/>
+            <w:tcW w:type="dxa" w:w="1020"/>
           </w:tcPr>
           <w:p>
             <w:pPr>
@@ -6832,7 +6477,7 @@
         </w:tc>
         <w:tc>
           <w:tcPr>
-            <w:tcW w:type="dxa" w:w="2646"/>
+            <w:tcW w:type="dxa" w:w="3402"/>
           </w:tcPr>
           <w:p>
             <w:pPr>
@@ -6854,7 +6499,7 @@
         </w:tc>
         <w:tc>
           <w:tcPr>
-            <w:tcW w:type="dxa" w:w="2646"/>
+            <w:tcW w:type="dxa" w:w="3175"/>
           </w:tcPr>
           <w:p>
             <w:pPr>
@@ -6881,7 +6526,7 @@
         </w:trPr>
         <w:tc>
           <w:tcPr>
-            <w:tcW w:type="dxa" w:w="2646"/>
+            <w:tcW w:type="dxa" w:w="1020"/>
           </w:tcPr>
           <w:p>
             <w:pPr>
@@ -6903,7 +6548,7 @@
         </w:tc>
         <w:tc>
           <w:tcPr>
-            <w:tcW w:type="dxa" w:w="2646"/>
+            <w:tcW w:type="dxa" w:w="3402"/>
           </w:tcPr>
           <w:p>
             <w:pPr>
@@ -6925,7 +6570,7 @@
         </w:tc>
         <w:tc>
           <w:tcPr>
-            <w:tcW w:type="dxa" w:w="2646"/>
+            <w:tcW w:type="dxa" w:w="3175"/>
           </w:tcPr>
           <w:p>
             <w:pPr>
@@ -6952,7 +6597,7 @@
         </w:trPr>
         <w:tc>
           <w:tcPr>
-            <w:tcW w:type="dxa" w:w="2646"/>
+            <w:tcW w:type="dxa" w:w="1020"/>
           </w:tcPr>
           <w:p>
             <w:pPr>
@@ -6974,7 +6619,7 @@
         </w:tc>
         <w:tc>
           <w:tcPr>
-            <w:tcW w:type="dxa" w:w="2646"/>
+            <w:tcW w:type="dxa" w:w="3402"/>
           </w:tcPr>
           <w:p>
             <w:pPr>
@@ -6996,7 +6641,7 @@
         </w:tc>
         <w:tc>
           <w:tcPr>
-            <w:tcW w:type="dxa" w:w="2646"/>
+            <w:tcW w:type="dxa" w:w="3175"/>
           </w:tcPr>
           <w:p>
             <w:pPr>

</xml_diff>